<commit_message>
barlow/finesst: promote v2 finals to lettered deliverables + refresh submission copies
All 14 promoted files verified: zero tracked changes, zero comments.
Cleaned leftover resolved comments + 4 tracked format records from
OSDMP_reworked and mentoring_plan_reworked before promotion.

Co-Authored-By: Claude Fable 5 <noreply@anthropic.com>
</commit_message>
<xml_diff>
--- a/barlow/finesst_final/A1_proposal_STM.docx
+++ b/barlow/finesst_final/A1_proposal_STM.docx
@@ -19,27 +19,56 @@
     </w:p>
     <w:p>
       <w:r>
-        <w:t>Summary: Previous work [1] has identified places where Antarctic Dry Valley streams are reshaping the land, but it stops at location and doesn’t examine the causes of stream migration. This project attempts to elucidate the drivers of channel migration. Using remote sensing and machine learning, it links the measured changes to the driving processes (heat, melt, thawing ground), extends the measurement from the channel centerline into the near-channel corridor, and attaches a real uncertainty value to every pixel.</w:t>
-      </w:r>
-      <w:r/>
-      <w:r/>
-      <w:r/>
-      <w:r/>
-      <w:r/>
-      <w:r/>
-      <w:r/>
-      <w:r/>
-      <w:r/>
-      <w:r/>
-      <w:r/>
-      <w:r/>
-      <w:r/>
-      <w:r/>
-      <w:r/>
-      <w:r/>
-      <w:r/>
-      <w:r/>
-      <w:r/>
+        <w:t xml:space="preserve">Summary: Previous work [1] has identified places where Antarctic Dry Valley streams are reshaping the land, but </w:t>
+      </w:r>
+      <w:r>
+        <w:t>the analysis</w:t>
+      </w:r>
+      <w:r>
+        <w:t xml:space="preserve"> </w:t>
+      </w:r>
+      <w:r>
+        <w:t xml:space="preserve">stops at </w:t>
+      </w:r>
+      <w:r>
+        <w:t xml:space="preserve">identifying </w:t>
+      </w:r>
+      <w:r>
+        <w:t>location</w:t>
+      </w:r>
+      <w:r>
+        <w:t>s</w:t>
+      </w:r>
+      <w:r>
+        <w:t xml:space="preserve"> and doesn’t examine the causes of stream migration. This project attempts to elucidate the drivers of channel migration. Using remote sensing and machine learning, it links the measured changes to the driving processes (heat, melt, thawing ground), </w:t>
+      </w:r>
+      <w:r>
+        <w:t>extends</w:t>
+      </w:r>
+      <w:r>
+        <w:t xml:space="preserve"> the measurement from the </w:t>
+      </w:r>
+      <w:r>
+        <w:t>channel centerline into the near-channel corridor,</w:t>
+      </w:r>
+      <w:r>
+        <w:t xml:space="preserve"> and attaches a</w:t>
+      </w:r>
+      <w:r>
+        <w:t>n</w:t>
+      </w:r>
+      <w:r>
+        <w:t xml:space="preserve"> </w:t>
+      </w:r>
+      <w:r>
+        <w:t>estimated</w:t>
+      </w:r>
+      <w:r>
+        <w:t xml:space="preserve"> </w:t>
+      </w:r>
+      <w:r>
+        <w:t>uncertainty value to every pixel.</w:t>
+      </w:r>
     </w:p>
     <w:p>
       <w:pPr>
@@ -50,7 +79,6 @@
       <w:r>
         <w:rPr>
           <w:b/>
-          <w:sz w:val="24"/>
         </w:rPr>
         <w:t>The Setup and the Gap</w:t>
       </w:r>
@@ -62,13 +90,23 @@
         </w:rPr>
       </w:pPr>
       <w:r>
-        <w:t>The McMurdo Dry Valleys (MDVs) are the largest ice-free region of Antarctica. For most of a century they were treated as one of Earth's most stable landscapes, lacking strong erosive forces. That view is now an open question. The valleys are energy-limited: ice is everywhere, and there is barely enough summer heat to melt much of it [9]. A small warming produces a measurable response — ephemeral streams (channels that flow only during a brief melt season) carry more water, move sediment, and reshape the terrain.</w:t>
-      </w:r>
-      <w:r/>
-      <w:r/>
-      <w:r/>
-      <w:r/>
-      <w:r/>
+        <w:t xml:space="preserve">The McMurdo Dry Valleys (MDVs) are the largest ice-free region of Antarctica. For </w:t>
+      </w:r>
+      <w:r>
+        <w:t>the better part</w:t>
+      </w:r>
+      <w:r>
+        <w:t xml:space="preserve"> </w:t>
+      </w:r>
+      <w:r>
+        <w:t>of a century they were treated as one of Earth's most stable landscapes, lacking strong erosive forces. That view is now an open question. The valleys are energy-limited: ice is everywhere, and there is barely enough summer heat to melt much of it [2]</w:t>
+      </w:r>
+      <w:r>
+        <w:t/>
+      </w:r>
+      <w:r>
+        <w:t>. A small warming produces a measurable response — ephemeral streams (channels that flow only during a brief melt season) carry more water, move sediment, and reshape the terrain.</w:t>
+      </w:r>
     </w:p>
     <w:p>
       <w:pPr>
@@ -94,7 +132,7 @@
                     <pic:cNvPicPr/>
                   </pic:nvPicPr>
                   <pic:blipFill>
-                    <a:blip r:embed="rId5"/>
+                    <a:blip r:embed="rId9"/>
                     <a:stretch>
                       <a:fillRect/>
                     </a:stretch>
@@ -123,26 +161,65 @@
         <w:rPr>
           <w:i/>
           <w:color w:val="404040"/>
-          <w:sz w:val="24"/>
-        </w:rPr>
-        <w:t xml:space="preserve">Figure 1. Study area. (A) The McMurdo Dry Valleys within Antarctica (coastline: Natural Earth). (B) Hillshade of the study-area LiDAR DEM (1 m), showing the incised valley-floor channels this project measures</w:t>
+        </w:rPr>
+        <w:t xml:space="preserve">Figure 1. Study area. (A) The McMurdo Dry Valleys within Antarctica (coastline: Natural Earth). (B) Hillshade of the study-area </w:t>
       </w:r>
       <w:r>
         <w:rPr>
           <w:i/>
           <w:color w:val="404040"/>
-          <w:sz w:val="24"/>
-        </w:rPr>
-        <w:t xml:space="preserve">.</w:t>
+        </w:rPr>
+        <w:t xml:space="preserve">airborne </w:t>
       </w:r>
       <w:r>
         <w:rPr>
           <w:i/>
           <w:color w:val="404040"/>
-          <w:sz w:val="24"/>
+        </w:rPr>
+        <w:t xml:space="preserve">LiDAR DEM (1 m), showing </w:t>
+      </w:r>
+      <w:r>
+        <w:rPr>
+          <w:i/>
+          <w:color w:val="404040"/>
+        </w:rPr>
+        <w:t>example</w:t>
+      </w:r>
+      <w:r>
+        <w:rPr>
+          <w:i/>
+          <w:color w:val="404040"/>
         </w:rPr>
         <w:t xml:space="preserve"> </w:t>
       </w:r>
+      <w:r>
+        <w:rPr>
+          <w:i/>
+          <w:color w:val="404040"/>
+        </w:rPr>
+        <w:t xml:space="preserve">incised valley-floor channels this project </w:t>
+      </w:r>
+      <w:r>
+        <w:rPr>
+          <w:i/>
+          <w:color w:val="404040"/>
+        </w:rPr>
+        <w:t>identifies and mensurates</w:t>
+      </w:r>
+      <w:r>
+        <w:rPr>
+          <w:i/>
+          <w:color w:val="404040"/>
+        </w:rPr>
+        <w:t>.</w:t>
+      </w:r>
+      <w:r>
+        <w:rPr>
+          <w:i/>
+          <w:color w:val="404040"/>
+        </w:rPr>
+        <w:t xml:space="preserve"> </w:t>
+      </w:r>
     </w:p>
     <w:p>
       <w:pPr>
@@ -153,7 +230,6 @@
       <w:r>
         <w:rPr>
           <w:b/>
-          <w:sz w:val="24"/>
         </w:rPr>
         <w:t>Present Data</w:t>
       </w:r>
@@ -167,10 +243,6 @@
       <w:r>
         <w:t>The prior dissertation and related publications [1, 2] laid the foundation for this study by providing the following initial data products:</w:t>
       </w:r>
-      <w:r/>
-      <w:r/>
-      <w:r/>
-      <w:r/>
     </w:p>
     <w:p>
       <w:pPr>
@@ -184,32 +256,19 @@
         </w:rPr>
       </w:pPr>
       <w:r>
-        <w:lastRenderedPageBreak/>
-        <w:t xml:space="preserve">A U-Net </w:t>
-      </w:r>
-      <w:r>
-        <w:t xml:space="preserve">ML methodology </w:t>
-      </w:r>
-      <w:r>
-        <w:t xml:space="preserve">[5] </w:t>
-      </w:r>
-      <w:r>
-        <w:t xml:space="preserve">that finds stream channels </w:t>
-      </w:r>
-      <w:r>
-        <w:t xml:space="preserve">using high</w:t>
-      </w:r>
-      <w:r>
-        <w:t xml:space="preserve">-</w:t>
-      </w:r>
-      <w:r>
-        <w:t xml:space="preserve">resolution terrain</w:t>
-      </w:r>
-      <w:r>
-        <w:t xml:space="preserve"> (elevation, slope, aspect)</w:t>
-      </w:r>
-      <w:r>
-        <w:t xml:space="preserve">. </w:t>
+        <w:t xml:space="preserve">A U-Net ML methodology </w:t>
+      </w:r>
+      <w:r>
+        <w:t xml:space="preserve">[3], [4] </w:t>
+      </w:r>
+      <w:r>
+        <w:t>that finds stream channels using high</w:t>
+      </w:r>
+      <w:r>
+        <w:t>-</w:t>
+      </w:r>
+      <w:r>
+        <w:t xml:space="preserve">resolution terrain (elevation, slope, aspect). </w:t>
       </w:r>
     </w:p>
     <w:p>
@@ -224,32 +283,36 @@
         </w:rPr>
       </w:pPr>
       <w:r>
-        <w:t xml:space="preserve">Initial verification that repeat</w:t>
-      </w:r>
-      <w:r>
-        <w:t xml:space="preserve">-acquisition airborne LiDAR and valley-</w:t>
-      </w:r>
-      <w:r>
-        <w:t xml:space="preserve">wide REMA (Reference Elevation Model of Antarctica) satellite DEMs [4] are precise and high-resolution enough to detect stream-corridor change once aligned to external control.</w:t>
-      </w:r>
-      <w:r/>
-      <w:r/>
-      <w:r/>
-      <w:r/>
-      <w:r/>
-      <w:r/>
-      <w:r/>
-      <w:r/>
-      <w:r/>
-      <w:r/>
-      <w:r/>
-      <w:r/>
-      <w:r/>
-      <w:r/>
-      <w:r/>
-      <w:r/>
-      <w:r/>
-      <w:r/>
+        <w:t>Initial verification that repeat</w:t>
+      </w:r>
+      <w:r>
+        <w:t>-acquisition airborne LiDAR and valley-</w:t>
+      </w:r>
+      <w:r>
+        <w:t xml:space="preserve">wide REMA (Reference Elevation Model of Antarctica) satellite DEMs [5] are </w:t>
+      </w:r>
+      <w:r>
+        <w:lastRenderedPageBreak/>
+        <w:t>precise and high-resolution enough to detect stream-corridor change</w:t>
+      </w:r>
+      <w:r>
+        <w:t>s</w:t>
+      </w:r>
+      <w:r>
+        <w:t xml:space="preserve"> once aligned to </w:t>
+      </w:r>
+      <w:r>
+        <w:t xml:space="preserve">a common geodetic datum and independent </w:t>
+      </w:r>
+      <w:r>
+        <w:t xml:space="preserve">external </w:t>
+      </w:r>
+      <w:r>
+        <w:t xml:space="preserve">ground </w:t>
+      </w:r>
+      <w:r>
+        <w:t>control.</w:t>
+      </w:r>
     </w:p>
     <w:p>
       <w:pPr>
@@ -281,7 +344,6 @@
       <w:r>
         <w:rPr>
           <w:b/>
-          <w:sz w:val="24"/>
         </w:rPr>
         <w:t>The Open Question</w:t>
       </w:r>
@@ -293,97 +355,154 @@
         </w:rPr>
       </w:pPr>
       <w:r>
-        <w:t>Detecting where channels change is now feasible; explaining why is not. The open question is which climate drivers set the rate of channel change, and whether melt energy or water volume dominates. This project attributes measured stream-channel change to those drivers and attaches calibrated per-pixel uncertainty to every measurement.</w:t>
-      </w:r>
-      <w:r/>
-      <w:r/>
-      <w:r/>
-      <w:r/>
-      <w:r/>
-      <w:r/>
-      <w:r/>
-      <w:r/>
-      <w:r/>
-      <w:commentRangeStart w:id="57"/>
-      <w:r/>
-      <w:commentRangeEnd w:id="57"/>
-      <w:r>
-        <w:rPr>
-          <w:rStyle w:val="CommentReference"/>
+        <w:t xml:space="preserve">Detecting where channels </w:t>
+      </w:r>
+      <w:r>
+        <w:t xml:space="preserve">are </w:t>
+      </w:r>
+      <w:r>
+        <w:t>chang</w:t>
+      </w:r>
+      <w:r>
+        <w:t>ing</w:t>
+      </w:r>
+      <w:r>
+        <w:t xml:space="preserve"> is now feasible; explaining </w:t>
+      </w:r>
+      <w:r>
+        <w:t xml:space="preserve">the </w:t>
+      </w:r>
+      <w:r>
+        <w:t>cause(s)</w:t>
+      </w:r>
+      <w:r>
+        <w:t xml:space="preserve"> of these changes</w:t>
+      </w:r>
+      <w:r>
+        <w:t xml:space="preserve"> </w:t>
+      </w:r>
+      <w:r>
+        <w:t>is not. The open question is which climate</w:t>
+      </w:r>
+      <w:r>
+        <w:t xml:space="preserve"> or landscape</w:t>
+      </w:r>
+      <w:r>
+        <w:t xml:space="preserve"> drivers set the rate of channel change, and whether melt energy</w:t>
+      </w:r>
+      <w:r>
+        <w:t xml:space="preserve">, </w:t>
+      </w:r>
+      <w:r>
+        <w:t>water volume</w:t>
+      </w:r>
+      <w:r>
+        <w:t xml:space="preserve"> or another possible variable</w:t>
+      </w:r>
+      <w:r>
+        <w:t xml:space="preserve"> dominates. This project attributes measured stream-channel change to those drivers and attaches calibrated per-pixel uncertainty to every measurement</w:t>
+      </w:r>
+      <w:r>
+        <w:t xml:space="preserve"> of change</w:t>
+      </w:r>
+      <w:r>
+        <w:t>.</w:t>
+      </w:r>
+    </w:p>
+    <w:p>
+      <w:pPr>
+        <w:rPr>
           <w:b/>
-          <w:sz w:val="24"/>
-          <w:szCs w:val="24"/>
-        </w:rPr>
-      </w:r>
-    </w:p>
-    <w:p>
-      <w:pPr>
+        </w:rPr>
+      </w:pPr>
+      <w:r>
         <w:rPr>
           <w:b/>
         </w:rPr>
-      </w:pPr>
-      <w:r>
+        <w:t>NASA Relevance</w:t>
+      </w:r>
+    </w:p>
+    <w:p>
+      <w:pPr>
         <w:rPr>
           <w:b/>
-          <w:sz w:val="24"/>
-        </w:rPr>
-        <w:t>NASA Relevance</w:t>
-      </w:r>
-    </w:p>
-    <w:p>
-      <w:pPr>
-        <w:rPr>
-          <w:b/>
         </w:rPr>
       </w:pPr>
       <w:r>
         <w:t xml:space="preserve">The </w:t>
       </w:r>
       <w:r>
-        <w:t xml:space="preserve">project sits in NASA’s Earth Science Division. The closest programs are Cryospheric Sciences and Terrestrial Hydrology, and both fund work on cold-region surface change and meltwater. The </w:t>
+        <w:t xml:space="preserve">project sits in NASA’s Earth Science Division. </w:t>
+      </w:r>
+      <w:r>
+        <w:t xml:space="preserve">It spans three of the Division’s research spheres. The Cryosphere covers polar glaciers and their meltwater, the Hydrosphere covers water moving through the stream network, and the Geosphere covers change in surface topography</w:t>
+      </w:r>
+      <w:r>
+        <w:t xml:space="preserve">. All three address cold-region surface change and meltwater. The </w:t>
       </w:r>
       <w:r>
         <w:t xml:space="preserve">2001 baseline is NASA data — an airborne </w:t>
       </w:r>
       <w:r>
-        <w:t xml:space="preserve">LiDAR</w:t>
+        <w:t>LiDAR</w:t>
       </w:r>
       <w:r>
         <w:t xml:space="preserve"> swath never fully exploited for surface change </w:t>
       </w:r>
       <w:r>
-        <w:t xml:space="preserve">[8]. The project turns the airborne LiDAR, REMA satellite DEMs (corrected and controlled by airborne LiDAR and ICESat-2 observations) and reanalysis</w:t>
-      </w:r>
-      <w:r>
-        <w:t xml:space="preserve"> into a continuing, uncertainty-calibrated record of climate-driven surface change in the Dry Valleys. The methods travel beyond the site to any elevation-differencing problem, including the surface-change records NASA missions such as ICESat-2 and NISAR produce. The analysis will also enable future change detection from the high</w:t>
-      </w:r>
-      <w:r>
-        <w:t xml:space="preserve">-</w:t>
-      </w:r>
-      <w:r>
-        <w:t xml:space="preserve">resolution terrain observations resulting from the possible future Surface Topography and Vegetation (STV) observing system. The Dry Valleys are also the canonical terrestrial analog for cold-desert planetary surfaces such as Mars. The proposed research also develops the skills NASA's open-science strategy calls for: open geospatial data, machine learning on remote sensing, and honest uncertainty.</w:t>
-      </w:r>
-      <w:r/>
-      <w:r/>
-      <w:r/>
-      <w:r/>
-      <w:r/>
-      <w:r/>
-      <w:r/>
-      <w:r/>
-      <w:r/>
-      <w:r/>
-      <w:r/>
-      <w:r/>
-      <w:r/>
-      <w:r/>
-      <w:r/>
-      <w:r/>
-      <w:r/>
-      <w:r/>
-      <w:r/>
-      <w:r/>
-      <w:r/>
+        <w:t>[6]. The project turns the airborne LiDAR, REMA satellite DEMs (corrected and controlled by airborne LiDAR and ICESat-2 observations) and reanalysis</w:t>
+      </w:r>
+      <w:r>
+        <w:t xml:space="preserve"> into a continuing, uncertainty-calibrated record of climate-driven surface change in the Dry Valleys. The </w:t>
+      </w:r>
+      <w:r>
+        <w:t>method</w:t>
+      </w:r>
+      <w:r>
+        <w:t>ology</w:t>
+      </w:r>
+      <w:r>
+        <w:t xml:space="preserve"> </w:t>
+      </w:r>
+      <w:r>
+        <w:t>is applicable</w:t>
+      </w:r>
+      <w:r>
+        <w:t xml:space="preserve"> </w:t>
+      </w:r>
+      <w:r>
+        <w:t xml:space="preserve">beyond the </w:t>
+      </w:r>
+      <w:r>
+        <w:t xml:space="preserve">McMurdo </w:t>
+      </w:r>
+      <w:r>
+        <w:t>Dry Valleys</w:t>
+      </w:r>
+      <w:r>
+        <w:t xml:space="preserve"> </w:t>
+      </w:r>
+      <w:r>
+        <w:t xml:space="preserve">to any elevation-differencing problem, including the surface-change records NASA missions such as </w:t>
+      </w:r>
+      <w:r>
+        <w:t xml:space="preserve">ICESat-2 and NISAR </w:t>
+      </w:r>
+      <w:r>
+        <w:t xml:space="preserve">produce. NISAR's left-looking, 12-day L-band coverage includes the Dry Valleys [7]. It maps surface deformation and coherence change, not elevation. It cannot supply DEMs, but it can flag melt-season bank disturbance as an independent check. The method also positions the project for the possible future Surface Topography and Vegetation (STV) observing system.</w:t>
+      </w:r>
+      <w:r>
+        <w:t xml:space="preserve"/>
+      </w:r>
+      <w:r>
+        <w:t xml:space="preserve"> The Dry Valleys are also the canonical terrestrial analog for cold-desert planetary surfaces such as Mars. The proposed research also develops the skills NASA's open-science strategy calls for: open geospatial data, machine learning on remote sensing, and </w:t>
+      </w:r>
+      <w:r>
+        <w:t>rigorous</w:t>
+      </w:r>
+      <w:r>
+        <w:t xml:space="preserve"> uncertainty.</w:t>
+      </w:r>
     </w:p>
     <w:p>
       <w:pPr>
@@ -402,13 +521,7 @@
     </w:p>
     <w:p>
       <w:r>
-        <w:t xml:space="preserve">The project considers </w:t>
-      </w:r>
-      <w:r>
-        <w:t>t</w:t>
-      </w:r>
-      <w:r>
-        <w:t xml:space="preserve">hree </w:t>
+        <w:t xml:space="preserve">The project considers three </w:t>
       </w:r>
       <w:r>
         <w:t>objectives:</w:t>
@@ -423,67 +536,16 @@
         </w:numPr>
       </w:pPr>
       <w:r>
-        <w:t xml:space="preserve">Attribution. Determination of which climate drivers control each stream's rate of geomorphic change. Candidate drivers — air temperature, incoming sunlight, meltwater discharge, glacial mass balance, and summer thaw — come from the McMurdo Dry Valleys LTER network (meteorology, stream gauges, glacier mass balance, and soil climate) [6], with ERA5 [7] and AMPS reanalysis filling coverage gaps. We hypothesize that melt energy will predict </w:t>
-      </w:r>
-      <w:r>
-        <w:t xml:space="preserve">channel change</w:t>
-      </w:r>
-      <w:r>
-        <w:t xml:space="preserve"> better than water volume alone</w:t>
-      </w:r>
-      <w:r>
-        <w:t xml:space="preserve"> (H1)</w:t>
-      </w:r>
-      <w:r>
-        <w:t xml:space="preserve">. The hypothesis is testable: if discharge alone </w:t>
-      </w:r>
-      <w:r>
-        <w:t xml:space="preserve">predicts channel migration as well as melt energy does,</w:t>
-      </w:r>
-      <w:r>
-        <w:t xml:space="preserve"> the hypothesis fails.</w:t>
-      </w:r>
-      <w:r/>
-      <w:r/>
-      <w:commentRangeStart w:id="80"/>
-      <w:r/>
-      <w:r/>
-      <w:r/>
-      <w:commentRangeEnd w:id="80"/>
-      <w:r>
-        <w:rPr>
-          <w:rStyle w:val="CommentReference"/>
-          <w:sz w:val="24"/>
-          <w:szCs w:val="24"/>
-        </w:rPr>
-      </w:r>
-      <w:r>
-        <w:t xml:space="preserve">Process attribution along the stream corridor. Beyond the channel centerline, classify change in the near-channel corridor — channel shift and avulsion, bank thaw and subsidence, and fan growth — by process type. Bedrock and stable soils outside the corridor provide the fixed reference used to georeference the REMA satellite DEM to the airborne LiDAR, so change is measured against genuinely stable ground rather than an assumption that the whole surface is moving.</w:t>
-      </w:r>
-      <w:r>
-        <w:t xml:space="preserve"> We expect each process type to carry its own driver fingerprint. Bank thaw should track summer thaw, channel shift should track peak discharge, and fan growth should follow both (H2). If every process type responds to the drivers the same way, the fingerprint idea fails and the classification carries no explanatory weight.</w:t>
-      </w:r>
-      <w:commentRangeEnd w:id="92"/>
-      <w:r>
-        <w:rPr>
-          <w:rStyle w:val="CommentReference"/>
-          <w:sz w:val="24"/>
-          <w:szCs w:val="24"/>
-        </w:rPr>
-      </w:r>
-    </w:p>
-    <w:p>
-      <w:pPr>
-        <w:ind w:left="720"/>
-      </w:pPr>
-      <w:r>
-        <w:t xml:space="preserve">The satellite record past 2014 exists only on the free REMA DEM, whose elevations are tricky to combine with </w:t>
-      </w:r>
-      <w:r>
-        <w:t xml:space="preserve">LiDAR</w:t>
-      </w:r>
-      <w:r>
-        <w:t xml:space="preserve"> in terrain-dependent ways. Correcting that is part of the method, not a chief objective.</w:t>
+        <w:t>Attribution</w:t>
+      </w:r>
+      <w:r>
+        <w:t xml:space="preserve"> (</w:t>
+      </w:r>
+      <w:r>
+        <w:t xml:space="preserve">Objective 1)</w:t>
+      </w:r>
+      <w:r>
+        <w:t xml:space="preserve">. Determination of the climate and landscape drivers that control each stream's rate of geomorphic change. Candidate controls fall into two groups. Climate forcing includes air temperature, incoming sunlight, meltwater discharge, glacial mass balance, and summer thaw. These records come from the McMurdo Dry Valleys LTER network [8], with ERA5 [9] and AMPS reanalysis filling coverage gaps. Substrate susceptibility includes microclimate zone, mapped permafrost and ground-ice class, and bed material, drawn from published MDV mapping [10], [11]. We hypothesize that melt energy will predict channel change better than water volume alone after controlling for substrate (H1). Forcing should matter most where ground ice is present. The hypothesis is testable. If discharge alone predicts channel migration as well as melt energy does, or if substrate class alone absorbs the explanatory power, the hypothesis fails.</w:t>
       </w:r>
     </w:p>
     <w:p>
@@ -494,17 +556,65 @@
           <w:numId w:val="3"/>
         </w:numPr>
       </w:pPr>
-      <w:commentRangeStart w:id="93"/>
-      <w:r>
-        <w:t>Calibrated uncertainty. Provide a per-pixel detection threshold for slope, aspect, and sensor, in place of a single valley-wide noise value. Success test: on ground that did not change, a 95% confidence threshold should be exceeded by 5% of pixels.</w:t>
-      </w:r>
-      <w:commentRangeEnd w:id="93"/>
-      <w:r>
-        <w:rPr>
-          <w:rStyle w:val="CommentReference"/>
-          <w:sz w:val="24"/>
-          <w:szCs w:val="24"/>
-        </w:rPr>
+      <w:r>
+        <w:t xml:space="preserve">Process </w:t>
+      </w:r>
+      <w:r>
+        <w:lastRenderedPageBreak/>
+        <w:t>attribution along the stream corridor</w:t>
+      </w:r>
+      <w:r>
+        <w:t xml:space="preserve"> (Objective 2)</w:t>
+      </w:r>
+      <w:r>
+        <w:t>. Beyond the channel centerline, classify change in the near-channel corridor — channel shift and avulsion, bank thaw and subsidence, and fan growth — by process type. Bedrock and stable soils outside the corridor provide the fixed reference used to georeference the REMA satellite DEM to the airborne LiDAR, so change is measured against genuinely stable ground rather than an assumption that the whole surface is moving.</w:t>
+      </w:r>
+      <w:r>
+        <w:t xml:space="preserve"> We expect each process type to carry its own driver fingerprint. Bank thaw should track summer thaw and ground-ice class, channel shift should track peak discharge, and fan growth should follow both (H2). If every process type responds to the drivers the same way, the fingerprint idea fails and the classification carries no explanatory weight.</w:t>
+      </w:r>
+    </w:p>
+    <w:p>
+      <w:pPr>
+        <w:pStyle w:val="ListParagraph"/>
+        <w:numPr>
+          <w:ilvl w:val="0"/>
+          <w:numId w:val="3"/>
+        </w:numPr>
+      </w:pPr>
+      <w:r>
+        <w:t>Calibrated uncertainty</w:t>
+      </w:r>
+      <w:r>
+        <w:t xml:space="preserve"> (Objective 3)</w:t>
+      </w:r>
+      <w:r>
+        <w:t xml:space="preserve">. </w:t>
+      </w:r>
+      <w:r>
+        <w:t>Provide</w:t>
+      </w:r>
+      <w:r>
+        <w:t xml:space="preserve"> a per-pixel detection threshold for slope, aspect, and </w:t>
+      </w:r>
+      <w:r>
+        <w:t>sensor, in place of a single valley-wide noise value.</w:t>
+      </w:r>
+      <w:r>
+        <w:t xml:space="preserve"> Success test: on ground that did not change, a 95% confidence threshold should be exceeded by 5% of pixels.</w:t>
+      </w:r>
+    </w:p>
+    <w:p>
+      <w:pPr>
+        <w:ind w:left="720"/>
+      </w:pPr>
+      <w:r>
+        <w:t xml:space="preserve">REMA, the only satellite elevation record past 2014, is tricky to combine with </w:t>
+      </w:r>
+      <w:r>
+        <w:t>LiDAR</w:t>
+      </w:r>
+      <w:r>
+        <w:t xml:space="preserve"> in terrain-dependent ways. Correcting that is part of the method, not a chief objective.</w:t>
       </w:r>
     </w:p>
     <w:p>
@@ -575,38 +685,46 @@
       <w:pPr>
         <w:jc w:val="center"/>
       </w:pPr>
-      <w:commentRangeStart w:id="94"/>
       <w:r>
         <w:rPr>
           <w:i/>
           <w:color w:val="404040"/>
-          <w:sz w:val="24"/>
-        </w:rPr>
-        <w:t>Figure 2. Planned detection-to-attribution workflow: three DEM epochs, co-registration to airborne-LiDAR and ICESat-2 control, DEM-of-Difference, per-pixel detection floor, then the O1 (channel), O2 (stream-corridor), and O3 (uncertainty) objectives. Method schematic; no results shown.</w:t>
-      </w:r>
-      <w:commentRangeEnd w:id="94"/>
-      <w:r>
-        <w:rPr>
-          <w:rStyle w:val="CommentReference"/>
+        </w:rPr>
+        <w:t xml:space="preserve">Figure 2. Planned detection-to-attribution workflow: three DEM epochs, </w:t>
+      </w:r>
+      <w:r>
+        <w:rPr>
           <w:i/>
           <w:color w:val="404040"/>
-          <w:sz w:val="24"/>
-          <w:szCs w:val="24"/>
-        </w:rPr>
+        </w:rPr>
+        <w:t>co-registration to airborne-LiDAR and ICESat-2 control,</w:t>
       </w:r>
       <w:r>
         <w:rPr>
           <w:i/>
           <w:color w:val="404040"/>
-          <w:sz w:val="24"/>
-        </w:rPr>
+        </w:rPr>
+        <w:t xml:space="preserve"> DEM-of-Difference, per-pixel detection floor, then the Objective 1 (channel), Objective 2 </w:t>
+      </w:r>
+      <w:r>
+        <w:rPr>
+          <w:i/>
+          <w:color w:val="404040"/>
+        </w:rPr>
+        <w:t>(stream-corridor),</w:t>
+      </w:r>
+      <w:r>
+        <w:rPr>
+          <w:i/>
+          <w:color w:val="404040"/>
+        </w:rPr>
+        <w:t xml:space="preserve"> and Objective 3 (uncertainty) objectives. Method schematic; no results shown.</w:t>
       </w:r>
     </w:p>
     <w:p>
       <w:r>
         <w:rPr>
           <w:b/>
-          <w:sz w:val="24"/>
         </w:rPr>
         <w:t>Objective 1:</w:t>
       </w:r>
@@ -619,9 +737,47 @@
           <w:numId w:val="5"/>
         </w:numPr>
       </w:pPr>
-      <w:commentRangeStart w:id="95"/>
-      <w:r>
-        <w:t>Objective 1 tests whether melt energy predicts channel change better than water volume alone. To test it, I measure each gauged stream's change rate: co-register the two elevation epochs (removing the median vertical offset over stable ground, with an optional ICP refinement), resample to a shared grid, difference them, keep only pixels whose change clears the detection floor (the per-pixel LOD95 threshold from objective 3), and integrate that change inside the channel outline, normalized by channel area and years elapsed to a rate in mm/yr.</w:t>
+      <w:r>
+        <w:t>Objective 1 tests whether melt energy predicts channel change better than water volume alone. To test it, I measure</w:t>
+      </w:r>
+      <w:r>
+        <w:t xml:space="preserve"> each gauged stream's change </w:t>
+      </w:r>
+      <w:r>
+        <w:t>rate:</w:t>
+      </w:r>
+      <w:r>
+        <w:t xml:space="preserve"> co-register the two elevation epochs (removing the median vertical offset over stable ground, with an optional ICP refinement), resample </w:t>
+      </w:r>
+      <w:r>
+        <w:t xml:space="preserve">to a shared grid, </w:t>
+      </w:r>
+      <w:r>
+        <w:t xml:space="preserve">difference </w:t>
+      </w:r>
+      <w:r>
+        <w:t>them,</w:t>
+      </w:r>
+      <w:r>
+        <w:t xml:space="preserve"> keep only pixels whose change clears the detection floor (the per-pixel LOD95 threshold from objective 3), </w:t>
+      </w:r>
+      <w:r>
+        <w:t>and integrate</w:t>
+      </w:r>
+      <w:r>
+        <w:t xml:space="preserve"> that change inside the </w:t>
+      </w:r>
+      <w:r>
+        <w:t xml:space="preserve">channel outline, </w:t>
+      </w:r>
+      <w:r>
+        <w:t>normalized</w:t>
+      </w:r>
+      <w:r>
+        <w:t xml:space="preserve"> by channel area and years elapsed to a </w:t>
+      </w:r>
+      <w:r>
+        <w:t>rate in mm/yr.</w:t>
       </w:r>
     </w:p>
     <w:p>
@@ -633,10 +789,7 @@
         </w:numPr>
       </w:pPr>
       <w:r>
-        <w:t xml:space="preserve">Build each stream's driver history from MDV-LTER station records, filling coverage gaps with the ERA5 and AMPS weather models.</w:t>
-      </w:r>
-      <w:r>
-        <w:t xml:space="preserve"> Some streams have no gauge and some gauges stopped recording early. For those, estimate discharge from sunlight. Fit a regression between measured discharge and the summer insolation on each gauged stream's source glacier, then apply it to the ungauged streams. That pushes the analysis past the 21 gauged streams and fills in the thin record after 2015.</w:t>
+        <w:t xml:space="preserve">Build a driver history for every stream, gauged or not. ERA5 and AMPS reanalysis supply temperature and radiation for every basin. Per-basin insolation is computed from the project DEMs, with terrain shading. Substrate covariates come from published maps and require no field records. The 21 LTER gauge records then calibrate a regression between measured discharge and summer insolation on each gauged stream's source glacier. That regression estimates discharge for the ungauged streams and for the thin record after 2015. LTER data calibrate and validate the driver set, but they do not limit its coverage.</w:t>
       </w:r>
     </w:p>
     <w:p>
@@ -648,8 +801,7 @@
         </w:numPr>
       </w:pPr>
       <w:r>
-        <w:lastRenderedPageBreak/>
-        <w:t>Fit two models, a hierarchical regression (grouped by stream) and a random forest. Validate by leave-one-stream-out cross-validation, so every score comes from a stream held out of the fit, and check that the two model families agree.</w:t>
+        <w:t xml:space="preserve">Fit two models, a hierarchical regression (grouped by stream, with substrate covariates) and a random forest, ranking variable importance across the full forcing-plus-substrate set. Validate by leave-one-stream-out cross-validation, so every score comes from a stream held out of the fit, and check that the two model families agree.</w:t>
       </w:r>
     </w:p>
     <w:p>
@@ -661,14 +813,13 @@
         </w:numPr>
       </w:pPr>
       <w:r>
-        <w:t>Test the melt energy hypothesis against the water volume alternative.</w:t>
+        <w:t xml:space="preserve">Test the melt energy hypothesis against the water volume alternative, controlling for substrate class.</w:t>
       </w:r>
     </w:p>
     <w:p>
       <w:r>
         <w:rPr>
           <w:b/>
-          <w:sz w:val="24"/>
         </w:rPr>
         <w:t>Objective 2:</w:t>
       </w:r>
@@ -682,7 +833,31 @@
         </w:numPr>
       </w:pPr>
       <w:r>
-        <w:t xml:space="preserve">Apply the objective-3 per-pixel thresholds along the stream corridor and pull out each change patch as a connected group of super-threshold pixels, dropping patches below a minimum mapping unit to suppress isolated-pixel noise. Bedrock and stable soils flanking the corridor supply the fixed reference used to co-register the sensors, so change is measured against genuinely stable ground.</w:t>
+        <w:t xml:space="preserve">Apply the objective-3 per-pixel thresholds </w:t>
+      </w:r>
+      <w:r>
+        <w:t>along the stream corridor</w:t>
+      </w:r>
+      <w:r>
+        <w:t xml:space="preserve"> and pull out each change patch as a connected group of super-threshold </w:t>
+      </w:r>
+      <w:r>
+        <w:t>pixels, dropping</w:t>
+      </w:r>
+      <w:r>
+        <w:t xml:space="preserve"> patches below a minimum mapping unit </w:t>
+      </w:r>
+      <w:r>
+        <w:t xml:space="preserve">to suppress isolated-pixel </w:t>
+      </w:r>
+      <w:r>
+        <w:t>noise. Bedrock and stable soils flanking the corridor supply the fixed reference used to co-register the sensors</w:t>
+      </w:r>
+      <w:r>
+        <w:t xml:space="preserve"> (using ICESat-2 and 2014 NCALM LiDAR)</w:t>
+      </w:r>
+      <w:r>
+        <w:t>, so change is measured against genuinely stable ground.</w:t>
       </w:r>
       <w:r>
         <w:t xml:space="preserve"> Stable ground is not a judgment call here. It is any area the channel detector marks as non-stream in every epoch, and that computed surface is the reference.</w:t>
@@ -721,29 +896,72 @@
         </w:numPr>
       </w:pPr>
       <w:r>
-        <w:t xml:space="preserve">As mentioned before, I measure the REMA-minus-</w:t>
-      </w:r>
-      <w:r>
-        <w:t xml:space="preserve">LiDAR</w:t>
-      </w:r>
-      <w:r>
-        <w:t xml:space="preserve"> difference over stable ground, model it against slope and aspect, and remove that bias before mixing the two sensors in any differencing.</w:t>
+        <w:t xml:space="preserve">As mentioned before, </w:t>
+      </w:r>
+      <w:r>
+        <w:t>the REMA-minus-</w:t>
+      </w:r>
+      <w:r>
+        <w:t>LiDAR</w:t>
+      </w:r>
+      <w:r>
+        <w:t xml:space="preserve"> difference over stable ground</w:t>
+      </w:r>
+      <w:r>
+        <w:t xml:space="preserve"> can be</w:t>
+      </w:r>
+      <w:r>
+        <w:t xml:space="preserve"> </w:t>
+      </w:r>
+      <w:r>
+        <w:t>model</w:t>
+      </w:r>
+      <w:r>
+        <w:t>ed</w:t>
+      </w:r>
+      <w:r>
+        <w:t xml:space="preserve"> against slope and aspect, and </w:t>
+      </w:r>
+      <w:r>
+        <w:t xml:space="preserve">used to </w:t>
+      </w:r>
+      <w:r>
+        <w:t xml:space="preserve">remove </w:t>
+      </w:r>
+      <w:r>
+        <w:t>any</w:t>
+      </w:r>
+      <w:r>
+        <w:t xml:space="preserve"> </w:t>
+      </w:r>
+      <w:r>
+        <w:t xml:space="preserve">bias before </w:t>
+      </w:r>
+      <w:r>
+        <w:t>differencing</w:t>
+      </w:r>
+      <w:r>
+        <w:t xml:space="preserve"> </w:t>
+      </w:r>
+      <w:r>
+        <w:t>the two sensors</w:t>
+      </w:r>
+      <w:r>
+        <w:t>.</w:t>
       </w:r>
     </w:p>
     <w:p>
       <w:r>
         <w:rPr>
           <w:b/>
-          <w:sz w:val="24"/>
-        </w:rPr>
-        <w:t xml:space="preserve">Objective 3</w:t>
+        </w:rPr>
+        <w:t>Objective 3</w:t>
       </w:r>
       <w:r>
         <w:rPr>
           <w:b/>
-          <w:sz w:val="24"/>
-        </w:rPr>
-        <w:t xml:space="preserve">:</w:t>
+        </w:rPr>
+        <w:t>:</w:t>
       </w:r>
     </w:p>
     <w:p>
@@ -755,7 +973,16 @@
         </w:numPr>
       </w:pPr>
       <w:r>
-        <w:t>Model the noise as a function of slope, aspect, and sensor pair instead of a single valley-wide value. I bin the stable-ground differences on those variables, take the NMAD in each bin, and fit a smooth surface through the bins so every pixel carries its own LOD95 (= 1.96 x NMAD) threshold.</w:t>
+        <w:t>Model the noise as a function of slope, aspect, and sensor pair instead of a single valley-wide value</w:t>
+      </w:r>
+      <w:r>
+        <w:t xml:space="preserve"> to adaptively estimate level of change </w:t>
+      </w:r>
+      <w:r>
+        <w:t>significance</w:t>
+      </w:r>
+      <w:r>
+        <w:t>. I bin the stable-ground differences on those variables, take the NMAD in each bin, and fit a smooth surface through the bins so every pixel carries its own LOD95 (= 1.96 x NMAD) threshold.</w:t>
       </w:r>
     </w:p>
     <w:p>
@@ -767,30 +994,97 @@
         </w:numPr>
       </w:pPr>
       <w:r>
-        <w:t xml:space="preserve">Publish it as a per-pixel threshold map and verify the 5%-on-stable-ground property.</w:t>
+        <w:t>Publish it as a per-pixel threshold map and verify the 5%-on-stable-ground property.</w:t>
       </w:r>
       <w:r>
         <w:t xml:space="preserve"> There is also a check that assumes nothing about stable ground. Difference a 2014 REMA DEM against the 2014 LiDAR DEM. Both map the same year, so the true change is zero. Whatever is left over is sensor error, and that is what calibrates the noise model.</w:t>
       </w:r>
-      <w:commentRangeEnd w:id="95"/>
-      <w:r>
-        <w:rPr>
-          <w:rStyle w:val="CommentReference"/>
-          <w:sz w:val="24"/>
-          <w:szCs w:val="24"/>
-        </w:rPr>
-        <w:commentReference w:id="95"/>
-      </w:r>
-    </w:p>
-    <w:p>
-      <w:r>
-        <w:t xml:space="preserve">Note that all methods use robust statistics</w:t>
-      </w:r>
-      <w:r>
-        <w:t xml:space="preserve"> [3]</w:t>
-      </w:r>
-      <w:r>
-        <w:t xml:space="preserve">, since elevation errors here are heavy-tailed and an ordinary standard deviation would be thrown off by a few blunders. The noise scale throughout is the NMAD (1.4826 times the median absolute deviation from the median). For a single surface the detection floor is LOD95 = 1.96 x NMAD; since a difference subtracts two noisy surfaces, their NMADs add in quadrature, so the differencing floor is 1.96 x sqrt(NMAD1^2 + NMAD2^2), the change that noise alone clears only 5% of the time. Everything (DEMs, channel outlines, driver fields) is reprojected to one common Antarctic polar-stereographic grid (EPSG:3294) first, and the two LiDAR epochs (2 m and 1 m native) are resampled to a shared cell size before differencing.</w:t>
+    </w:p>
+    <w:p>
+      <w:r>
+        <w:lastRenderedPageBreak/>
+        <w:t>Note that all methods use robust statistics</w:t>
+      </w:r>
+      <w:r>
+        <w:t xml:space="preserve"> [12]</w:t>
+      </w:r>
+      <w:r>
+        <w:t xml:space="preserve">, since elevation errors here are heavy-tailed and an ordinary standard deviation would be thrown off by a few blunders. The noise scale throughout is the NMAD (1.4826 times the median absolute deviation from the median). For a single surface the detection floor is LOD95 = 1.96 × NMAD; since a difference subtracts two noisy surfaces, their NMADs add in quadrature, so the differencing floor is</w:t>
+      </w:r>
+    </w:p>
+    <w:p>
+      <w:pPr>
+        <w:jc w:val="center"/>
+        <w:spacing w:before="80" w:after="80"/>
+      </w:pPr>
+      <m:oMathPara>
+        <m:oMath>
+          <m:sSub>
+            <m:e>
+              <m:r>
+                <m:t>LOD</m:t>
+              </m:r>
+            </m:e>
+            <m:sub>
+              <m:r>
+                <m:t>95,diff</m:t>
+              </m:r>
+            </m:sub>
+          </m:sSub>
+          <m:r>
+            <m:t xml:space="preserve"> = 1.96 </m:t>
+          </m:r>
+          <m:rad>
+            <m:radPr>
+              <m:degHide m:val="1"/>
+            </m:radPr>
+            <m:deg/>
+            <m:e>
+              <m:sSubSup>
+                <m:e>
+                  <m:r>
+                    <m:t>NMAD</m:t>
+                  </m:r>
+                </m:e>
+                <m:sub>
+                  <m:r>
+                    <m:t>1</m:t>
+                  </m:r>
+                </m:sub>
+                <m:sup>
+                  <m:r>
+                    <m:t>2</m:t>
+                  </m:r>
+                </m:sup>
+              </m:sSubSup>
+              <m:r>
+                <m:t xml:space="preserve"> + </m:t>
+              </m:r>
+              <m:sSubSup>
+                <m:e>
+                  <m:r>
+                    <m:t>NMAD</m:t>
+                  </m:r>
+                </m:e>
+                <m:sub>
+                  <m:r>
+                    <m:t>2</m:t>
+                  </m:r>
+                </m:sub>
+                <m:sup>
+                  <m:r>
+                    <m:t>2</m:t>
+                  </m:r>
+                </m:sup>
+              </m:sSubSup>
+            </m:e>
+          </m:rad>
+        </m:oMath>
+      </m:oMathPara>
+    </w:p>
+    <w:p>
+      <w:r>
+        <w:t>The change that noise alone clears only 5% of the time. Everything (DEMs, channel outlines, driver fields) is reprojected to one common Antarctic polar-stereographic grid (EPSG:3294) first, and the two LiDAR epochs (2 m and 1 m native) are resampled to a shared cell size before differencing.</w:t>
       </w:r>
     </w:p>
     <w:p>
@@ -809,10 +1103,7 @@
     </w:p>
     <w:p>
       <w:r>
-        <w:t>All data is free</w:t>
-      </w:r>
-      <w:r>
-        <w:t xml:space="preserve">ly available</w:t>
+        <w:t>All data is freely available</w:t>
       </w:r>
       <w:r>
         <w:t xml:space="preserve"> or has been given with permission from the author.</w:t>
@@ -826,9 +1117,9 @@
         <w:tblLook w:val="04A0" w:firstRow="1" w:lastRow="0" w:firstColumn="1" w:lastColumn="0" w:noHBand="0" w:noVBand="1"/>
       </w:tblPr>
       <w:tblGrid>
-        <w:gridCol w:w="3114"/>
-        <w:gridCol w:w="3129"/>
-        <w:gridCol w:w="3107"/>
+        <w:gridCol w:w="3113"/>
+        <w:gridCol w:w="3128"/>
+        <w:gridCol w:w="3109"/>
       </w:tblGrid>
       <w:tr>
         <w:trPr>
@@ -1133,7 +1424,6 @@
                 <w:rFonts w:ascii="Times New Roman" w:hAnsi="Times New Roman"/>
                 <w:sz w:val="18"/>
               </w:rPr>
-              <w:lastRenderedPageBreak/>
               <w:t>Meteorology, glacier mass balance, soil temperature</w:t>
             </w:r>
           </w:p>
@@ -1241,7 +1531,6 @@
             <w:pPr>
               <w:spacing w:after="20"/>
             </w:pPr>
-            <w:commentRangeStart w:id="96"/>
             <w:r>
               <w:rPr>
                 <w:rFonts w:ascii="Times New Roman" w:hAnsi="Times New Roman"/>
@@ -1282,15 +1571,6 @@
                 <w:sz w:val="18"/>
               </w:rPr>
               <w:t>public, free</w:t>
-            </w:r>
-            <w:commentRangeEnd w:id="96"/>
-            <w:r>
-              <w:rPr>
-                <w:rStyle w:val="CommentReference"/>
-                <w:sz w:val="24"/>
-                <w:szCs w:val="24"/>
-              </w:rPr>
-              <w:commentReference w:id="96"/>
             </w:r>
           </w:p>
         </w:tc>
@@ -1352,45 +1632,131 @@
         </w:tc>
       </w:tr>
       <w:tr>
-        <w:tc>
-          <w:tcPr>
-            <w:tcW w:type="dxa" w:w="3114"/>
-          </w:tcPr>
-          <w:p>
-            <w:r>
+        <w:trPr>
+          <w:jc w:val="center"/>
+        </w:trPr>
+        <w:tc>
+          <w:tcPr>
+            <w:tcW w:w="3114" w:type="dxa"/>
+          </w:tcPr>
+          <w:p>
+            <w:pPr>
               <w:rPr>
                 <w:sz w:val="18"/>
                 <w:szCs w:val="18"/>
               </w:rPr>
+            </w:pPr>
+            <w:r>
+              <w:rPr>
+                <w:sz w:val="18"/>
+                <w:szCs w:val="18"/>
+              </w:rPr>
               <w:t>ICESat-2 elevation (external control)</w:t>
             </w:r>
           </w:p>
         </w:tc>
         <w:tc>
           <w:tcPr>
-            <w:tcW w:type="dxa" w:w="3129"/>
-          </w:tcPr>
-          <w:p>
-            <w:r>
+            <w:tcW w:w="3129" w:type="dxa"/>
+          </w:tcPr>
+          <w:p>
+            <w:pPr>
               <w:rPr>
                 <w:sz w:val="18"/>
                 <w:szCs w:val="18"/>
               </w:rPr>
+            </w:pPr>
+            <w:r>
+              <w:rPr>
+                <w:sz w:val="18"/>
+                <w:szCs w:val="18"/>
+              </w:rPr>
               <w:t>NASA NSIDC DAAC</w:t>
             </w:r>
           </w:p>
         </w:tc>
         <w:tc>
           <w:tcPr>
-            <w:tcW w:type="dxa" w:w="3107"/>
-          </w:tcPr>
-          <w:p>
-            <w:r>
+            <w:tcW w:w="3107" w:type="dxa"/>
+          </w:tcPr>
+          <w:p>
+            <w:pPr>
               <w:rPr>
                 <w:sz w:val="18"/>
                 <w:szCs w:val="18"/>
               </w:rPr>
+            </w:pPr>
+            <w:r>
+              <w:rPr>
+                <w:sz w:val="18"/>
+                <w:szCs w:val="18"/>
+              </w:rPr>
               <w:t>public, free</w:t>
+            </w:r>
+          </w:p>
+        </w:tc>
+      </w:tr>
+      <w:tr>
+        <w:trPr>
+          <w:jc w:val="center"/>
+        </w:trPr>
+        <w:tc>
+          <w:tcPr>
+            <w:tcW w:w="3114" w:type="dxa"/>
+          </w:tcPr>
+          <w:p>
+            <w:pPr>
+              <w:rPr>
+                <w:sz w:val="18"/>
+                <w:szCs w:val="18"/>
+              </w:rPr>
+            </w:pPr>
+            <w:r>
+              <w:rPr>
+                <w:sz w:val="18"/>
+                <w:szCs w:val="18"/>
+              </w:rPr>
+              <w:t xml:space="preserve">Permafrost / ground-ice and microclimate-zone maps</w:t>
+            </w:r>
+          </w:p>
+        </w:tc>
+        <w:tc>
+          <w:tcPr>
+            <w:tcW w:w="3129" w:type="dxa"/>
+          </w:tcPr>
+          <w:p>
+            <w:pPr>
+              <w:rPr>
+                <w:sz w:val="18"/>
+                <w:szCs w:val="18"/>
+              </w:rPr>
+            </w:pPr>
+            <w:r>
+              <w:rPr>
+                <w:sz w:val="18"/>
+                <w:szCs w:val="18"/>
+              </w:rPr>
+              <w:t xml:space="preserve">published MDV mapping [10], [11]</w:t>
+            </w:r>
+          </w:p>
+        </w:tc>
+        <w:tc>
+          <w:tcPr>
+            <w:tcW w:w="3107" w:type="dxa"/>
+          </w:tcPr>
+          <w:p>
+            <w:pPr>
+              <w:rPr>
+                <w:sz w:val="18"/>
+                <w:szCs w:val="18"/>
+              </w:rPr>
+            </w:pPr>
+            <w:r>
+              <w:rPr>
+                <w:sz w:val="18"/>
+                <w:szCs w:val="18"/>
+              </w:rPr>
+              <w:t xml:space="preserve">public, free</w:t>
             </w:r>
           </w:p>
         </w:tc>
@@ -1406,30 +1772,34 @@
       <w:r>
         <w:rPr>
           <w:b/>
-          <w:sz w:val="24"/>
         </w:rPr>
         <w:t>Computing</w:t>
       </w:r>
     </w:p>
     <w:p>
-      <w:commentRangeStart w:id="97"/>
-      <w:r>
-        <w:t>A single workstation GPU trains the segmentation models, and the elevation processing is CPU-bound and modest. Free access to the host institution's high-performance computing cluster is available for any heavier batch processing, though the project does not depend on it. Raster stacks reach tens of gigabytes and need only local storage.</w:t>
-      </w:r>
-      <w:commentRangeEnd w:id="97"/>
-      <w:r>
-        <w:rPr>
-          <w:rStyle w:val="CommentReference"/>
-          <w:sz w:val="24"/>
-          <w:szCs w:val="24"/>
-        </w:rPr>
+      <w:r>
+        <w:t xml:space="preserve">A single workstation GPU trains the segmentation </w:t>
+      </w:r>
+      <w:r>
+        <w:t>models, and</w:t>
+      </w:r>
+      <w:r>
+        <w:t xml:space="preserve"> the elevation processing is CPU-bound and modest. </w:t>
+      </w:r>
+      <w:r>
+        <w:t>Free access to the host institution's high-performance computing cluster is available for any heavier batch processing, though the project does not depend on it. Raster</w:t>
+      </w:r>
+      <w:r>
+        <w:t xml:space="preserve"> stacks reach tens of gigabytes and need only local </w:t>
+      </w:r>
+      <w:r>
+        <w:t>storage.</w:t>
       </w:r>
     </w:p>
     <w:p>
       <w:r>
         <w:rPr>
           <w:b/>
-          <w:sz w:val="24"/>
         </w:rPr>
         <w:t>Skills and Mentoring</w:t>
       </w:r>
@@ -1443,23 +1813,19 @@
       <w:r>
         <w:rPr>
           <w:b/>
-          <w:sz w:val="24"/>
         </w:rPr>
         <w:t>Dissemination</w:t>
       </w:r>
     </w:p>
     <w:p>
-      <w:commentRangeStart w:id="98"/>
-      <w:r>
-        <w:t>Results will reach the cryosphere community through presentations at AGU and polar-science meetings and through open-access publications and archived data products with DOIs. Because the analysis relies only on public data, it can proceed independently.</w:t>
-      </w:r>
-      <w:commentRangeEnd w:id="98"/>
-      <w:r>
-        <w:rPr>
-          <w:rStyle w:val="CommentReference"/>
-          <w:sz w:val="24"/>
-          <w:szCs w:val="24"/>
-        </w:rPr>
+      <w:r>
+        <w:t>Results will reach the cryosphere community through presentations at AGU and polar-science meetings and through open-access publications and archived data products with DOIs. Because the analysis relies only on public data, it</w:t>
+      </w:r>
+      <w:r>
+        <w:t xml:space="preserve"> can proceed </w:t>
+      </w:r>
+      <w:r>
+        <w:t>independently.</w:t>
       </w:r>
     </w:p>
     <w:p>
@@ -1473,19 +1839,19 @@
           <w:b/>
           <w:sz w:val="32"/>
         </w:rPr>
+        <w:lastRenderedPageBreak/>
         <w:t>Assessment</w:t>
       </w:r>
     </w:p>
     <w:p>
       <w:r>
-        <w:t>Several things could go wrong and yield bad or incomplete results.</w:t>
+        <w:t xml:space="preserve">The project is designed to keep risk low, and the main threats to the work have been mitigated as far as project design allows. A few could still affect the completeness of the results. Each is described below with its mitigation.</w:t>
       </w:r>
     </w:p>
     <w:p>
       <w:r>
         <w:rPr>
           <w:b/>
-          <w:sz w:val="24"/>
         </w:rPr>
         <w:t>Attribution Signal</w:t>
       </w:r>
@@ -1495,7 +1861,7 @@
         <w:t xml:space="preserve">The signal may be weak. With </w:t>
       </w:r>
       <w:r>
-        <w:t xml:space="preserve">21</w:t>
+        <w:t>21</w:t>
       </w:r>
       <w:r>
         <w:t xml:space="preserve"> gauged streams and only 3 epochs, the sample is small. If no driver clearly outperforms another, the deliverable becomes a rigorous null result with calibrated uncertainty — useful, if less exciting. The risk is to impact, not feasibility.</w:t>
@@ -1505,45 +1871,60 @@
       <w:r>
         <w:rPr>
           <w:b/>
-          <w:sz w:val="24"/>
         </w:rPr>
         <w:t>Gauge Records</w:t>
       </w:r>
     </w:p>
     <w:p>
       <w:r>
-        <w:t xml:space="preserve">Gauge records are patchy after 2015. Stream gauging in the MDVs declined, and some streams have only a few dozen recorded days in the satellite epoch. This is why objective 1 leans on modeled melt energy rather than gauges alone — though it means the discharge side of the hypothesis is weakest in the most recent period.</w:t>
-      </w:r>
-      <w:r>
-        <w:t xml:space="preserve"> The sunlight-to-discharge regression in objective 1 buys part of that back. The gauged years teach the proxy, and the proxy then covers the ungauged streams and seasons.</w:t>
+        <w:t>Gauge records are patchy after 2015. Stream gauging in the MDVs declined, and some streams have only a few dozen recorded days in the satellite epoch. This is why objective 1 leans on modeled melt energy rather than gauges alone — though it means the discharge side of the hypothesis is weakest in the most recent period.</w:t>
+      </w:r>
+      <w:r>
+        <w:t xml:space="preserve"> The sunlight-to-discharge regression in objective 1 </w:t>
+      </w:r>
+      <w:r>
+        <w:t>mitigates this risk</w:t>
+      </w:r>
+      <w:r>
+        <w:t>. The gauged years teach the proxy, and the proxy then covers the ungauged streams and seasons.</w:t>
       </w:r>
     </w:p>
     <w:p>
       <w:r>
         <w:rPr>
           <w:b/>
-          <w:sz w:val="24"/>
         </w:rPr>
         <w:t>Satellite Coverage</w:t>
       </w:r>
     </w:p>
     <w:p>
       <w:r>
-        <w:t>Coverage is uneven. REMA quality varies by location and date. Taylor Valley has the best three-epoch coverage and will anchor the acceleration claims; other valleys may support only two.</w:t>
+        <w:t>Coverage is uneven. REMA quality varies by location and date. Taylor Valley has the best three-epoch coverage and will anchor the acceleration claims; other valleys may support only two</w:t>
+      </w:r>
+      <w:r>
+        <w:t xml:space="preserve"> </w:t>
+      </w:r>
+      <w:r>
+        <w:t>– this requires more detailed analysis of the individual available REMA DEMs</w:t>
+      </w:r>
+      <w:r>
+        <w:t>.</w:t>
       </w:r>
     </w:p>
     <w:p>
       <w:r>
         <w:rPr>
           <w:b/>
-          <w:sz w:val="24"/>
         </w:rPr>
         <w:t>Change Scale</w:t>
       </w:r>
     </w:p>
     <w:p>
       <w:r>
-        <w:t>Outside the channels, change may be too small to detect. The valley floors change slowly, so much of the surface may sit below our detection threshold. If so, objective 2 stays tight to the channel and its immediate margins, and results are reported at that scope.</w:t>
+        <w:t xml:space="preserve">Outside the channels, change may be too small to detect. The valley floors change slowly, so much of the surface may sit below our detection threshold. If so, objective 2 </w:t>
+      </w:r>
+      <w:r>
+        <w:t>stays tight to the channel and its immediate margins, and results are reported at that scope.</w:t>
       </w:r>
     </w:p>
     <w:p>
@@ -1551,7 +1932,7 @@
         <w:t xml:space="preserve">Even so, the proposal is worth doing. The MDV streams are the most direct, measurable climate response in one of Earth's most stable landscapes, and the data — two </w:t>
       </w:r>
       <w:r>
-        <w:t xml:space="preserve">LiDAR</w:t>
+        <w:t>LiDAR</w:t>
       </w:r>
       <w:r>
         <w:t xml:space="preserve"> epochs, a satellite record, and LTER station records — already exist and are free.</w:t>
@@ -1563,7 +1944,6 @@
       <w:r>
         <w:rPr>
           <w:b/>
-          <w:sz w:val="24"/>
         </w:rPr>
         <w:t>Timeline</w:t>
       </w:r>
@@ -1576,9 +1956,9 @@
         <w:tblLook w:val="04A0" w:firstRow="1" w:lastRow="0" w:firstColumn="1" w:lastColumn="0" w:noHBand="0" w:noVBand="1"/>
       </w:tblPr>
       <w:tblGrid>
-        <w:gridCol w:w="3102"/>
-        <w:gridCol w:w="3126"/>
-        <w:gridCol w:w="3122"/>
+        <w:gridCol w:w="3092"/>
+        <w:gridCol w:w="3143"/>
+        <w:gridCol w:w="3115"/>
       </w:tblGrid>
       <w:tr>
         <w:trPr>
@@ -1676,7 +2056,7 @@
                 <w:rFonts w:ascii="Times New Roman" w:hAnsi="Times New Roman"/>
                 <w:sz w:val="18"/>
               </w:rPr>
-              <w:t>Rebuild the change-detection chain from public data; harmonize driver records per stream; secure or rebuild training labels; first attribution model (Taylor Valley)</w:t>
+              <w:t xml:space="preserve">Rebuild the change-detection chain from public data; harmonize driver records per stream; secure or rebuild training labels; first attribution model (Objective 1, Taylor Valley)</w:t>
             </w:r>
           </w:p>
         </w:tc>
@@ -1732,7 +2112,14 @@
                 <w:rFonts w:ascii="Times New Roman" w:hAnsi="Times New Roman"/>
                 <w:sz w:val="18"/>
               </w:rPr>
-              <w:t>Stream-corridor process attribution (O2), gated by the O3 thresholds; driver tests per change type; sensor-disagreement correction</w:t>
+              <w:t>Stream-corridor process attribution</w:t>
+            </w:r>
+            <w:r>
+              <w:rPr>
+                <w:rFonts w:ascii="Times New Roman" w:hAnsi="Times New Roman"/>
+                <w:sz w:val="18"/>
+              </w:rPr>
+              <w:t xml:space="preserve"> (Objective 2), gated by the Objective 3 thresholds; driver tests per change type; sensor-disagreement correction</w:t>
             </w:r>
           </w:p>
         </w:tc>
@@ -1788,7 +2175,15 @@
                 <w:rFonts w:ascii="Times New Roman" w:hAnsi="Times New Roman"/>
                 <w:sz w:val="18"/>
               </w:rPr>
-              <w:t>Per-pixel calibrated-uncertainty product; three-epoch acceleration analysis; extension beyond Taylor Valley where REMA supports it; synthesis</w:t>
+              <w:t xml:space="preserve">Per-pixel calibrated-uncertainty product; three-epoch acceleration analysis; extension beyond Taylor </w:t>
+            </w:r>
+            <w:r>
+              <w:rPr>
+                <w:rFonts w:ascii="Times New Roman" w:hAnsi="Times New Roman"/>
+                <w:sz w:val="18"/>
+              </w:rPr>
+              <w:lastRenderedPageBreak/>
+              <w:t>Valley where REMA supports it; synthesis</w:t>
             </w:r>
           </w:p>
         </w:tc>
@@ -1805,6 +2200,7 @@
                 <w:rFonts w:ascii="Times New Roman" w:hAnsi="Times New Roman"/>
                 <w:sz w:val="18"/>
               </w:rPr>
+              <w:lastRenderedPageBreak/>
               <w:t>Synthesis paper; public data products with DOIs</w:t>
             </w:r>
           </w:p>
@@ -1820,7 +2216,6 @@
     </w:p>
     <w:p>
       <w:pPr>
-        <w:spacing w:after="120"/>
         <w:rPr>
           <w:rFonts w:ascii="Times New Roman" w:hAnsi="Times New Roman"/>
         </w:rPr>
@@ -1839,7 +2234,19 @@
         <w:rPr>
           <w:rFonts w:ascii="Times New Roman" w:hAnsi="Times New Roman"/>
         </w:rPr>
-        <w:t>All inputs are public and cited to source (NASA ATM, NCALM/OpenTopography, PGC REMA, MCM-LTER/EDI, Copernicus ERA5, AMPS/GDEX). All derived products — change rasters, process-classified change maps, per-stream rate tables, uncertainty layers, channel outlines, and processing code — will be released open-access with DOIs (Zenodo / EDI). Heavy regenerable rasters stay out of version control; scripts, tables, and figures are tracked. Products carry explicit coordinate-system, method, and uncertainty metadata.</w:t>
+        <w:t xml:space="preserve">All inputs are public and cited to source. All derived products and processing code</w:t>
+      </w:r>
+      <w:r>
+        <w:rPr>
+          <w:rFonts w:ascii="Times New Roman" w:hAnsi="Times New Roman"/>
+        </w:rPr>
+        <w:t xml:space="preserve"/>
+      </w:r>
+      <w:r>
+        <w:rPr>
+          <w:rFonts w:ascii="Times New Roman" w:hAnsi="Times New Roman"/>
+        </w:rPr>
+        <w:t xml:space="preserve"> will be released open-access with DOIs (Zenodo / EDI). Formats, archives, and metadata are detailed in the accompanying OSDMP.</w:t>
       </w:r>
     </w:p>
     <w:p>
@@ -1860,36 +2267,60 @@
       </w:r>
     </w:p>
     <w:p>
-      <w:pPr>
-        <w:spacing w:after="120"/>
-      </w:pPr>
       <w:r>
         <w:rPr>
           <w:rFonts w:ascii="Times New Roman" w:hAnsi="Times New Roman"/>
         </w:rPr>
         <w:t>[1] Barlow, M. C. (2026). A Comprehensive Spatial Analysis of Stream Boundary and Geomorphological Change Detection: McMurdo Dry Valleys, Antarctica. PhD Dissertation.</w:t>
+      </w:r>
+    </w:p>
+    <w:p>
+      <w:r>
+        <w:rPr>
+          <w:rFonts w:ascii="Times New Roman" w:hAnsi="Times New Roman"/>
+        </w:rPr>
+        <w:t>[2] Fountain, A. G., et al. (1999). Physical controls on the Taylor Valley ecosystem, Antarctica. BioScience 49(12):961</w:t>
+      </w:r>
+      <w:r>
+        <w:rPr>
+          <w:rFonts w:ascii="Times New Roman" w:hAnsi="Times New Roman"/>
+        </w:rPr>
+        <w:t>–</w:t>
+      </w:r>
+      <w:r>
+        <w:rPr>
+          <w:rFonts w:ascii="Times New Roman" w:hAnsi="Times New Roman"/>
+        </w:rPr>
+        <w:t>971.</w:t>
+      </w:r>
+    </w:p>
+    <w:p>
+      <w:r>
+        <w:rPr>
+          <w:rFonts w:ascii="Times New Roman" w:hAnsi="Times New Roman"/>
+        </w:rPr>
+        <w:t xml:space="preserve">[3] Ronneberger, O., Fischer, P., &amp; Brox, T. (2015). U-Net: Convolutional Networks for Biomedical Image Segmentation. </w:t>
       </w:r>
       <w:r>
         <w:rPr>
           <w:rFonts w:ascii="Times New Roman" w:hAnsi="Times New Roman"/>
           <w:i/>
         </w:rPr>
+        <w:t>MICCAI</w:t>
       </w:r>
       <w:r>
         <w:rPr>
           <w:rFonts w:ascii="Times New Roman" w:hAnsi="Times New Roman"/>
         </w:rPr>
-      </w:r>
-    </w:p>
-    <w:p>
-      <w:pPr>
-        <w:spacing w:after="120"/>
-      </w:pPr>
+        <w:t xml:space="preserve"> 234–241.</w:t>
+      </w:r>
+    </w:p>
+    <w:p>
       <w:r>
         <w:rPr>
           <w:rFonts w:ascii="Times New Roman" w:hAnsi="Times New Roman"/>
         </w:rPr>
-        <w:t xml:space="preserve">[2] Barlow, M. C., Zhu, X., &amp; Glennie, C. L. (2022). Stream Boundary Detection of a Hyper-Arid, Polar Region Using a U-Net Architecture: Taylor Valley, Antarctica. </w:t>
+        <w:t xml:space="preserve">[4] Barlow, M. C., Zhu, X., &amp; Glennie, C. L. (2022). Stream Boundary Detection of a Hyper-Arid, Polar Region Using a U-Net Architecture: Taylor Valley, Antarctica. </w:t>
       </w:r>
       <w:r>
         <w:rPr>
@@ -1906,188 +2337,154 @@
       </w:r>
     </w:p>
     <w:p>
-      <w:pPr>
-        <w:spacing w:after="120"/>
-      </w:pPr>
       <w:r>
         <w:rPr>
           <w:rFonts w:ascii="Times New Roman" w:hAnsi="Times New Roman"/>
         </w:rPr>
-        <w:t xml:space="preserve">[3] Höhle, J., &amp; Höhle, M. (2009). Accuracy assessment of digital elevation models by means of robust statistical methods. </w:t>
+        <w:t xml:space="preserve">[5] Howat, I. M., et al. (2019). The Reference Elevation Model of Antarctica (REMA). </w:t>
       </w:r>
       <w:r>
         <w:rPr>
           <w:rFonts w:ascii="Times New Roman" w:hAnsi="Times New Roman"/>
           <w:i/>
         </w:rPr>
-        <w:t>ISPRS J. Photogramm. Remote Sens.</w:t>
+        <w:t>The Cryosphere</w:t>
       </w:r>
       <w:r>
         <w:rPr>
           <w:rFonts w:ascii="Times New Roman" w:hAnsi="Times New Roman"/>
         </w:rPr>
-        <w:t xml:space="preserve"> 64(4):398–406.</w:t>
-      </w:r>
-    </w:p>
-    <w:p>
-      <w:pPr>
-        <w:spacing w:after="120"/>
-      </w:pPr>
+        <w:t xml:space="preserve"> 13:665–674.</w:t>
+      </w:r>
+    </w:p>
+    <w:p>
       <w:r>
         <w:rPr>
           <w:rFonts w:ascii="Times New Roman" w:hAnsi="Times New Roman"/>
         </w:rPr>
-        <w:lastRenderedPageBreak/>
-        <w:t xml:space="preserve">[4] Howat, I. M., et al. (2019). The Reference Elevation Model of Antarctica (REMA). </w:t>
+        <w:t>[6] Schenk, T., Csatho, B., Ahn, Y., Yoon, T., Shin, S. W., &amp; Huh, K. I. (2004). DEM generation from the Antarctic LiDAR data: Site report. US Geological Survey.</w:t>
+      </w:r>
+    </w:p>
+    <w:p>
+      <w:r>
+        <w:rPr>
+          <w:rFonts w:ascii="Times New Roman" w:hAnsi="Times New Roman"/>
+        </w:rPr>
+        <w:t xml:space="preserve">[7] </w:t>
       </w:r>
       <w:r>
         <w:rPr>
           <w:rFonts w:ascii="Times New Roman" w:hAnsi="Times New Roman"/>
           <w:i/>
         </w:rPr>
-        <w:t>The Cryosphere</w:t>
+        <w:t xml:space="preserve">NASA-ISRO SAR (NISAR) Mission Science Users' Handbook</w:t>
       </w:r>
       <w:r>
         <w:rPr>
           <w:rFonts w:ascii="Times New Roman" w:hAnsi="Times New Roman"/>
         </w:rPr>
-        <w:t xml:space="preserve"> 13:665–674.</w:t>
-      </w:r>
-    </w:p>
-    <w:p>
-      <w:pPr>
-        <w:spacing w:after="120"/>
-      </w:pPr>
+        <w:t xml:space="preserve">, 2nd ed. (2025). NASA Jet Propulsion Laboratory.</w:t>
+      </w:r>
+    </w:p>
+    <w:p>
       <w:r>
         <w:rPr>
           <w:rFonts w:ascii="Times New Roman" w:hAnsi="Times New Roman"/>
         </w:rPr>
-        <w:t xml:space="preserve">[5] Ronneberger, O., Fischer, P., &amp; Brox, T. (2015). U-Net: Convolutional Networks for Biomedical Image Segmentation. </w:t>
+        <w:t xml:space="preserve">[8] McMurdo Dry Valleys LTER. Stream, meteorology, glacier, and soil datasets. Environmental Data Initiative (EDI), </w:t>
+      </w:r>
+      <w:r>
+        <w:t>knb-lter-mcm.*</w:t>
+      </w:r>
+      <w:r>
+        <w:rPr>
+          <w:rFonts w:ascii="Times New Roman" w:hAnsi="Times New Roman"/>
+        </w:rPr>
+        <w:t>.</w:t>
+      </w:r>
+    </w:p>
+    <w:p>
+      <w:r>
+        <w:rPr>
+          <w:rFonts w:ascii="Times New Roman" w:hAnsi="Times New Roman"/>
+        </w:rPr>
+        <w:t xml:space="preserve">[9] Hersbach, H., et al. (2020). The ERA5 global reanalysis. </w:t>
       </w:r>
       <w:r>
         <w:rPr>
           <w:rFonts w:ascii="Times New Roman" w:hAnsi="Times New Roman"/>
           <w:i/>
         </w:rPr>
-        <w:t>MICCAI</w:t>
+        <w:t>Q. J. R. Meteorol. Soc.</w:t>
       </w:r>
       <w:r>
         <w:rPr>
           <w:rFonts w:ascii="Times New Roman" w:hAnsi="Times New Roman"/>
         </w:rPr>
-        <w:t xml:space="preserve"> 234–241.</w:t>
-      </w:r>
-    </w:p>
-    <w:p>
-      <w:pPr>
-        <w:spacing w:after="120"/>
-      </w:pPr>
+        <w:t xml:space="preserve"> 146:1999–2049.</w:t>
+      </w:r>
+    </w:p>
+    <w:p>
       <w:r>
         <w:rPr>
           <w:rFonts w:ascii="Times New Roman" w:hAnsi="Times New Roman"/>
         </w:rPr>
-        <w:t xml:space="preserve">[6] McMurdo Dry Valleys LTER. Stream, meteorology, glacier, and soil datasets. Environmental Data Initiative (EDI), </w:t>
-      </w:r>
-      <w:r>
-        <w:t>knb-lter-mcm.*</w:t>
-      </w:r>
-      <w:r>
-        <w:rPr>
-          <w:rFonts w:ascii="Times New Roman" w:hAnsi="Times New Roman"/>
-        </w:rPr>
-        <w:t>.</w:t>
-      </w:r>
-    </w:p>
-    <w:p>
-      <w:pPr>
-        <w:spacing w:after="120"/>
-      </w:pPr>
-      <w:r>
-        <w:rPr>
-          <w:rFonts w:ascii="Times New Roman" w:hAnsi="Times New Roman"/>
-        </w:rPr>
-        <w:t xml:space="preserve">[7] Hersbach, H., et al. (2020). The ERA5 global reanalysis. </w:t>
+        <w:t xml:space="preserve">[10] Fountain, A. G., Levy, J. S., Gooseff, M. N., &amp; Van Horn, D. (2014). The McMurdo Dry Valleys: A landscape on the threshold of change. </w:t>
       </w:r>
       <w:r>
         <w:rPr>
           <w:rFonts w:ascii="Times New Roman" w:hAnsi="Times New Roman"/>
           <w:i/>
         </w:rPr>
-        <w:t>Q. J. R. Meteorol. Soc.</w:t>
+        <w:t xml:space="preserve">Geomorphology</w:t>
       </w:r>
       <w:r>
         <w:rPr>
           <w:rFonts w:ascii="Times New Roman" w:hAnsi="Times New Roman"/>
         </w:rPr>
-        <w:t xml:space="preserve"> 146:1999–2049.</w:t>
-      </w:r>
-    </w:p>
-    <w:p>
-      <w:pPr>
-        <w:spacing w:after="120"/>
-      </w:pPr>
+        <w:t xml:space="preserve"> 225:25–35.</w:t>
+      </w:r>
+    </w:p>
+    <w:p>
       <w:r>
         <w:rPr>
           <w:rFonts w:ascii="Times New Roman" w:hAnsi="Times New Roman"/>
         </w:rPr>
-        <w:t xml:space="preserve">[8] Schenk, T., Csatho, B., Ahn, Y., Yoon, T., Shin, S. W., &amp; Huh, K. I. (2004). DEM generation from the Antarctic </w:t>
-      </w:r>
-      <w:r>
-        <w:rPr>
-          <w:rFonts w:ascii="Times New Roman" w:hAnsi="Times New Roman"/>
-        </w:rPr>
-        <w:t xml:space="preserve">LiDAR</w:t>
-      </w:r>
-      <w:r>
-        <w:rPr>
-          <w:rFonts w:ascii="Times New Roman" w:hAnsi="Times New Roman"/>
-        </w:rPr>
-        <w:t xml:space="preserve"> data: Site report. US Geological Survey.</w:t>
+        <w:t xml:space="preserve">[11] Bockheim, J. G., Campbell, I. B., &amp; McLeod, M. (2007). Permafrost distribution and active-layer depths in the McMurdo Dry Valleys, Antarctica. </w:t>
       </w:r>
       <w:r>
         <w:rPr>
           <w:rFonts w:ascii="Times New Roman" w:hAnsi="Times New Roman"/>
           <w:i/>
         </w:rPr>
+        <w:t xml:space="preserve">Permafrost and Periglacial Processes</w:t>
       </w:r>
       <w:r>
         <w:rPr>
           <w:rFonts w:ascii="Times New Roman" w:hAnsi="Times New Roman"/>
         </w:rPr>
-      </w:r>
-    </w:p>
-    <w:p>
-      <w:pPr>
-        <w:spacing w:after="120"/>
-      </w:pPr>
+        <w:t xml:space="preserve"> 18(3):217–227.</w:t>
+      </w:r>
+    </w:p>
+    <w:p>
       <w:r>
         <w:rPr>
           <w:rFonts w:ascii="Times New Roman" w:hAnsi="Times New Roman"/>
         </w:rPr>
-        <w:t xml:space="preserve">[9] Fountain, A. G., et al. (1999). Physical controls on the Taylor Valley ecosystem, Antarctica. BioScience 49(12):961</w:t>
-      </w:r>
-      <w:r>
-        <w:rPr>
-          <w:rFonts w:ascii="Times New Roman" w:hAnsi="Times New Roman"/>
-        </w:rPr>
-        <w:t xml:space="preserve">–</w:t>
-      </w:r>
-      <w:r>
-        <w:rPr>
-          <w:rFonts w:ascii="Times New Roman" w:hAnsi="Times New Roman"/>
-        </w:rPr>
-        <w:t xml:space="preserve">971.</w:t>
+        <w:t xml:space="preserve">[12] Höhle, J., &amp; Höhle, M. (2009). Accuracy assessment of digital elevation models by means of robust statistical methods. </w:t>
       </w:r>
       <w:r>
         <w:rPr>
           <w:rFonts w:ascii="Times New Roman" w:hAnsi="Times New Roman"/>
           <w:i/>
         </w:rPr>
+        <w:t>ISPRS J. Photogramm. Remote Sens.</w:t>
       </w:r>
       <w:r>
         <w:rPr>
           <w:rFonts w:ascii="Times New Roman" w:hAnsi="Times New Roman"/>
         </w:rPr>
+        <w:t xml:space="preserve"> 64(4):398–406.</w:t>
       </w:r>
     </w:p>
     <w:sectPr>
@@ -2101,223 +2498,40 @@
 </file>
 
 <file path=word/comments.xml><?xml version="1.0" encoding="utf-8"?>
-<w:comments xmlns:wpc="http://schemas.microsoft.com/office/word/2010/wordprocessingCanvas" xmlns:cx="http://schemas.microsoft.com/office/drawing/2014/chartex" xmlns:cx1="http://schemas.microsoft.com/office/drawing/2015/9/8/chartex" xmlns:cx2="http://schemas.microsoft.com/office/drawing/2015/10/21/chartex" xmlns:cx3="http://schemas.microsoft.com/office/drawing/2016/5/9/chartex" xmlns:cx4="http://schemas.microsoft.com/office/drawing/2016/5/10/chartex" xmlns:cx5="http://schemas.microsoft.com/office/drawing/2016/5/11/chartex" xmlns:cx6="http://schemas.microsoft.com/office/drawing/2016/5/12/chartex" xmlns:cx7="http://schemas.microsoft.com/office/drawing/2016/5/13/chartex" xmlns:cx8="http://schemas.microsoft.com/office/drawing/2016/5/14/chartex" xmlns:mc="http://schemas.openxmlformats.org/markup-compatibility/2006" xmlns:aink="http://schemas.microsoft.com/office/drawing/2016/ink" xmlns:am3d="http://schemas.microsoft.com/office/drawing/2017/model3d" xmlns:o="urn:schemas-microsoft-com:office:office" xmlns:oel="http://schemas.microsoft.com/office/2019/extlst" xmlns:r="http://schemas.openxmlformats.org/officeDocument/2006/relationships" xmlns:m="http://schemas.openxmlformats.org/officeDocument/2006/math" xmlns:v="urn:schemas-microsoft-com:vml" xmlns:wp14="http://schemas.microsoft.com/office/word/2010/wordprocessingDrawing" xmlns:wp="http://schemas.openxmlformats.org/drawingml/2006/wordprocessingDrawing" xmlns:w10="urn:schemas-microsoft-com:office:word" xmlns:w="http://schemas.openxmlformats.org/wordprocessingml/2006/main" xmlns:w14="http://schemas.microsoft.com/office/word/2010/wordml" xmlns:w15="http://schemas.microsoft.com/office/word/2012/wordml" xmlns:w16cex="http://schemas.microsoft.com/office/word/2018/wordml/cex" xmlns:w16cid="http://schemas.microsoft.com/office/word/2016/wordml/cid" xmlns:w16="http://schemas.microsoft.com/office/word/2018/wordml" xmlns:w16du="http://schemas.microsoft.com/office/word/2023/wordml/word16du" xmlns:w16sdtdh="http://schemas.microsoft.com/office/word/2020/wordml/sdtdatahash" xmlns:w16sdtfl="http://schemas.microsoft.com/office/word/2024/wordml/sdtformatlock" xmlns:w16se="http://schemas.microsoft.com/office/word/2015/wordml/symex" xmlns:wpg="http://schemas.microsoft.com/office/word/2010/wordprocessingGroup" xmlns:wpi="http://schemas.microsoft.com/office/word/2010/wordprocessingInk" xmlns:wne="http://schemas.microsoft.com/office/word/2006/wordml" xmlns:wps="http://schemas.microsoft.com/office/word/2010/wordprocessingShape" mc:Ignorable="w14 w15 w16se w16cid w16 w16cex w16sdtdh w16sdtfl w16du wp14">
-  <w:comment w:id="57" w:author="Craig Glennie" w:date="2026-07-08T19:18:00Z" w:initials="CG">
-    <w:p>
-      <w:r>
-        <w:rPr>
-          <w:rStyle w:val="CommentReference"/>
-        </w:rPr>
-        <w:annotationRef/>
-      </w:r>
-      <w:r>
-        <w:rPr>
-          <w:sz w:val="20"/>
-          <w:szCs w:val="20"/>
-        </w:rPr>
-        <w:t>I don't think this is well supported.  I think focusing on stream channels is fine - you don't need to bring the rest of the valleys into the equation.</w:t>
-      </w:r>
-    </w:p>
-  </w:comment>
-  <w:comment w:id="80" w:author="Craig Glennie" w:date="2026-07-08T19:39:00Z" w:initials="CG">
-    <w:p>
-      <w:r>
-        <w:rPr>
-          <w:rStyle w:val="CommentReference"/>
-        </w:rPr>
-        <w:annotationRef/>
-      </w:r>
-      <w:r>
-        <w:rPr>
-          <w:sz w:val="20"/>
-          <w:szCs w:val="20"/>
-        </w:rPr>
-        <w:t>What is the source of all this data?</w:t>
-      </w:r>
-    </w:p>
-  </w:comment>
-  <w:comment w:id="92" w:author="Craig Glennie" w:date="2026-07-08T19:36:00Z" w:initials="CG">
-    <w:p>
-      <w:r>
-        <w:rPr>
-          <w:rStyle w:val="CommentReference"/>
-        </w:rPr>
-        <w:annotationRef/>
-      </w:r>
-      <w:r>
-        <w:rPr>
-          <w:sz w:val="20"/>
-          <w:szCs w:val="20"/>
-        </w:rPr>
-        <w:t>Again.  Be careful with this one.  You need to have stable areas to georeference the REMA DEMs - if you assume everything is moving then you can't do this.</w:t>
-      </w:r>
-    </w:p>
-  </w:comment>
-  <w:comment w:id="93" w:author="Craig Glennie" w:date="2026-07-08T19:37:00Z" w:initials="CG">
-    <w:p>
-      <w:r>
-        <w:rPr>
-          <w:rStyle w:val="CommentReference"/>
-        </w:rPr>
-        <w:annotationRef/>
-      </w:r>
-      <w:r>
-        <w:rPr>
-          <w:sz w:val="20"/>
-          <w:szCs w:val="20"/>
-        </w:rPr>
-        <w:t>Relying too much on the dissertation for background.  Explain this as an objective without stating that it was a deficiency of the dissertation.</w:t>
-      </w:r>
-    </w:p>
-    <w:p/>
-    <w:p>
-      <w:r>
-        <w:rPr>
-          <w:sz w:val="20"/>
-          <w:szCs w:val="20"/>
-        </w:rPr>
-        <w:t>You want to show that you are doing something new - not correcting the errors or shortcomings in some else's work.</w:t>
-      </w:r>
-    </w:p>
-  </w:comment>
-  <w:comment w:id="94" w:author="Craig Glennie" w:date="2026-07-08T19:39:00Z" w:initials="CG">
-    <w:p>
-      <w:r>
-        <w:rPr>
-          <w:rStyle w:val="CommentReference"/>
-        </w:rPr>
-        <w:annotationRef/>
-      </w:r>
-      <w:r>
-        <w:rPr>
-          <w:sz w:val="20"/>
-          <w:szCs w:val="20"/>
-        </w:rPr>
-        <w:t xml:space="preserve">You have NCALM LiDAR data here, but haven't mentioned it previously.  </w:t>
-      </w:r>
-    </w:p>
-    <w:p/>
-    <w:p>
-      <w:r>
-        <w:rPr>
-          <w:sz w:val="20"/>
-          <w:szCs w:val="20"/>
-        </w:rPr>
-        <w:t>Work ICESat-2 into this figure - you need to use current NASA instruments to show NASA relevance.</w:t>
-      </w:r>
-    </w:p>
-  </w:comment>
-  <w:comment w:id="95" w:author="Craig Glennie" w:date="2026-07-08T19:41:00Z" w:initials="CG">
-    <w:p>
-      <w:r>
-        <w:rPr>
-          <w:rStyle w:val="CommentReference"/>
-        </w:rPr>
-        <w:annotationRef/>
-      </w:r>
-      <w:r>
-        <w:rPr>
-          <w:sz w:val="20"/>
-          <w:szCs w:val="20"/>
-        </w:rPr>
-        <w:t>This step by step process indicates that it is easy to do and really doesn't require research.  You need to reformulate this more generally and ideally as hypotheses.</w:t>
-      </w:r>
-    </w:p>
-  </w:comment>
-  <w:comment w:id="96" w:author="Craig Glennie" w:date="2026-07-08T19:41:00Z" w:initials="CG">
-    <w:p>
-      <w:r>
-        <w:rPr>
-          <w:rStyle w:val="CommentReference"/>
-        </w:rPr>
-        <w:annotationRef/>
-      </w:r>
-      <w:r>
-        <w:rPr>
-          <w:sz w:val="20"/>
-          <w:szCs w:val="20"/>
-        </w:rPr>
-        <w:t>This needs more NASA data in it - even it is only tangential to the analysis.</w:t>
-      </w:r>
-    </w:p>
-  </w:comment>
-  <w:comment w:id="97" w:author="Craig Glennie" w:date="2026-07-08T19:42:00Z" w:initials="CG">
-    <w:p>
-      <w:r>
-        <w:rPr>
-          <w:rStyle w:val="CommentReference"/>
-        </w:rPr>
-        <w:annotationRef/>
-      </w:r>
-      <w:r>
-        <w:rPr>
-          <w:sz w:val="20"/>
-          <w:szCs w:val="20"/>
-        </w:rPr>
-        <w:t>Mention free access to the UH high performance computing resources.</w:t>
-      </w:r>
-    </w:p>
-  </w:comment>
-  <w:comment w:id="98" w:author="Craig Glennie" w:date="2026-07-08T19:43:00Z" w:initials="CG">
-    <w:p>
-      <w:r>
-        <w:rPr>
-          <w:rStyle w:val="CommentReference"/>
-        </w:rPr>
-        <w:annotationRef/>
-      </w:r>
-      <w:r>
-        <w:rPr>
-          <w:sz w:val="20"/>
-          <w:szCs w:val="20"/>
-        </w:rPr>
-        <w:t>This is more about disseminating your work - presenting in conferences like AGU.</w:t>
-      </w:r>
-    </w:p>
-  </w:comment>
-</w:comments>
+<w:comments xmlns:wpc="http://schemas.microsoft.com/office/word/2010/wordprocessingCanvas" xmlns:cx="http://schemas.microsoft.com/office/drawing/2014/chartex" xmlns:cx1="http://schemas.microsoft.com/office/drawing/2015/9/8/chartex" xmlns:cx2="http://schemas.microsoft.com/office/drawing/2015/10/21/chartex" xmlns:cx3="http://schemas.microsoft.com/office/drawing/2016/5/9/chartex" xmlns:cx4="http://schemas.microsoft.com/office/drawing/2016/5/10/chartex" xmlns:cx5="http://schemas.microsoft.com/office/drawing/2016/5/11/chartex" xmlns:cx6="http://schemas.microsoft.com/office/drawing/2016/5/12/chartex" xmlns:cx7="http://schemas.microsoft.com/office/drawing/2016/5/13/chartex" xmlns:cx8="http://schemas.microsoft.com/office/drawing/2016/5/14/chartex" xmlns:mc="http://schemas.openxmlformats.org/markup-compatibility/2006" xmlns:aink="http://schemas.microsoft.com/office/drawing/2016/ink" xmlns:am3d="http://schemas.microsoft.com/office/drawing/2017/model3d" xmlns:o="urn:schemas-microsoft-com:office:office" xmlns:oel="http://schemas.microsoft.com/office/2019/extlst" xmlns:r="http://schemas.openxmlformats.org/officeDocument/2006/relationships" xmlns:m="http://schemas.openxmlformats.org/officeDocument/2006/math" xmlns:v="urn:schemas-microsoft-com:vml" xmlns:wp14="http://schemas.microsoft.com/office/word/2010/wordprocessingDrawing" xmlns:wp="http://schemas.openxmlformats.org/drawingml/2006/wordprocessingDrawing" xmlns:w10="urn:schemas-microsoft-com:office:word" xmlns:w="http://schemas.openxmlformats.org/wordprocessingml/2006/main" xmlns:w14="http://schemas.microsoft.com/office/word/2010/wordml" xmlns:w15="http://schemas.microsoft.com/office/word/2012/wordml" xmlns:w16cex="http://schemas.microsoft.com/office/word/2018/wordml/cex" xmlns:w16cid="http://schemas.microsoft.com/office/word/2016/wordml/cid" xmlns:w16="http://schemas.microsoft.com/office/word/2018/wordml" xmlns:w16du="http://schemas.microsoft.com/office/word/2023/wordml/word16du" xmlns:w16sdtdh="http://schemas.microsoft.com/office/word/2020/wordml/sdtdatahash" xmlns:w16sdtfl="http://schemas.microsoft.com/office/word/2024/wordml/sdtformatlock" xmlns:w16se="http://schemas.microsoft.com/office/word/2015/wordml/symex" xmlns:wpg="http://schemas.microsoft.com/office/word/2010/wordprocessingGroup" xmlns:wpi="http://schemas.microsoft.com/office/word/2010/wordprocessingInk" xmlns:wne="http://schemas.microsoft.com/office/word/2006/wordml" xmlns:wps="http://schemas.microsoft.com/office/word/2010/wordprocessingShape" mc:Ignorable="w14 w15 w16se w16cid w16 w16cex w16sdtdh w16sdtfl w16du wp14"/>
 </file>
 
 <file path=word/commentsExtended.xml><?xml version="1.0" encoding="utf-8"?>
-<w15:commentsEx xmlns:wpc="http://schemas.microsoft.com/office/word/2010/wordprocessingCanvas" xmlns:cx="http://schemas.microsoft.com/office/drawing/2014/chartex" xmlns:cx1="http://schemas.microsoft.com/office/drawing/2015/9/8/chartex" xmlns:cx2="http://schemas.microsoft.com/office/drawing/2015/10/21/chartex" xmlns:cx3="http://schemas.microsoft.com/office/drawing/2016/5/9/chartex" xmlns:cx4="http://schemas.microsoft.com/office/drawing/2016/5/10/chartex" xmlns:cx5="http://schemas.microsoft.com/office/drawing/2016/5/11/chartex" xmlns:cx6="http://schemas.microsoft.com/office/drawing/2016/5/12/chartex" xmlns:cx7="http://schemas.microsoft.com/office/drawing/2016/5/13/chartex" xmlns:cx8="http://schemas.microsoft.com/office/drawing/2016/5/14/chartex" xmlns:mc="http://schemas.openxmlformats.org/markup-compatibility/2006" xmlns:aink="http://schemas.microsoft.com/office/drawing/2016/ink" xmlns:am3d="http://schemas.microsoft.com/office/drawing/2017/model3d" xmlns:o="urn:schemas-microsoft-com:office:office" xmlns:oel="http://schemas.microsoft.com/office/2019/extlst" xmlns:r="http://schemas.openxmlformats.org/officeDocument/2006/relationships" xmlns:m="http://schemas.openxmlformats.org/officeDocument/2006/math" xmlns:v="urn:schemas-microsoft-com:vml" xmlns:wp14="http://schemas.microsoft.com/office/word/2010/wordprocessingDrawing" xmlns:wp="http://schemas.openxmlformats.org/drawingml/2006/wordprocessingDrawing" xmlns:w10="urn:schemas-microsoft-com:office:word" xmlns:w="http://schemas.openxmlformats.org/wordprocessingml/2006/main" xmlns:w14="http://schemas.microsoft.com/office/word/2010/wordml" xmlns:w15="http://schemas.microsoft.com/office/word/2012/wordml" xmlns:w16cex="http://schemas.microsoft.com/office/word/2018/wordml/cex" xmlns:w16cid="http://schemas.microsoft.com/office/word/2016/wordml/cid" xmlns:w16="http://schemas.microsoft.com/office/word/2018/wordml" xmlns:w16du="http://schemas.microsoft.com/office/word/2023/wordml/word16du" xmlns:w16sdtdh="http://schemas.microsoft.com/office/word/2020/wordml/sdtdatahash" xmlns:w16sdtfl="http://schemas.microsoft.com/office/word/2024/wordml/sdtformatlock" xmlns:w16se="http://schemas.microsoft.com/office/word/2015/wordml/symex" xmlns:wpg="http://schemas.microsoft.com/office/word/2010/wordprocessingGroup" xmlns:wpi="http://schemas.microsoft.com/office/word/2010/wordprocessingInk" xmlns:wne="http://schemas.microsoft.com/office/word/2006/wordml" xmlns:wps="http://schemas.microsoft.com/office/word/2010/wordprocessingShape" mc:Ignorable="w14 w15 w16se w16cid w16 w16cex w16sdtdh w16sdtfl w16du wp14">
-  <w15:commentEx w15:paraId="42DB2C3E" w15:done="0"/>
-  <w15:commentEx w15:paraId="3AF30051" w15:done="0"/>
-  <w15:commentEx w15:paraId="56E0FEBE" w15:done="0"/>
-  <w15:commentEx w15:paraId="5BDBC21D" w15:done="0"/>
-  <w15:commentEx w15:paraId="4B3ADC4A" w15:done="0"/>
-  <w15:commentEx w15:paraId="5D2B74BB" w15:done="0"/>
-  <w15:commentEx w15:paraId="2815AA70" w15:done="0"/>
-  <w15:commentEx w15:paraId="06BA7F9F" w15:done="0"/>
-  <w15:commentEx w15:paraId="0A164EE6" w15:done="0"/>
-</w15:commentsEx>
+<w15:commentsEx xmlns:wpc="http://schemas.microsoft.com/office/word/2010/wordprocessingCanvas" xmlns:cx="http://schemas.microsoft.com/office/drawing/2014/chartex" xmlns:cx1="http://schemas.microsoft.com/office/drawing/2015/9/8/chartex" xmlns:cx2="http://schemas.microsoft.com/office/drawing/2015/10/21/chartex" xmlns:cx3="http://schemas.microsoft.com/office/drawing/2016/5/9/chartex" xmlns:cx4="http://schemas.microsoft.com/office/drawing/2016/5/10/chartex" xmlns:cx5="http://schemas.microsoft.com/office/drawing/2016/5/11/chartex" xmlns:cx6="http://schemas.microsoft.com/office/drawing/2016/5/12/chartex" xmlns:cx7="http://schemas.microsoft.com/office/drawing/2016/5/13/chartex" xmlns:cx8="http://schemas.microsoft.com/office/drawing/2016/5/14/chartex" xmlns:mc="http://schemas.openxmlformats.org/markup-compatibility/2006" xmlns:aink="http://schemas.microsoft.com/office/drawing/2016/ink" xmlns:am3d="http://schemas.microsoft.com/office/drawing/2017/model3d" xmlns:o="urn:schemas-microsoft-com:office:office" xmlns:oel="http://schemas.microsoft.com/office/2019/extlst" xmlns:r="http://schemas.openxmlformats.org/officeDocument/2006/relationships" xmlns:m="http://schemas.openxmlformats.org/officeDocument/2006/math" xmlns:v="urn:schemas-microsoft-com:vml" xmlns:wp14="http://schemas.microsoft.com/office/word/2010/wordprocessingDrawing" xmlns:wp="http://schemas.openxmlformats.org/drawingml/2006/wordprocessingDrawing" xmlns:w10="urn:schemas-microsoft-com:office:word" xmlns:w="http://schemas.openxmlformats.org/wordprocessingml/2006/main" xmlns:w14="http://schemas.microsoft.com/office/word/2010/wordml" xmlns:w15="http://schemas.microsoft.com/office/word/2012/wordml" xmlns:w16cex="http://schemas.microsoft.com/office/word/2018/wordml/cex" xmlns:w16cid="http://schemas.microsoft.com/office/word/2016/wordml/cid" xmlns:w16="http://schemas.microsoft.com/office/word/2018/wordml" xmlns:w16du="http://schemas.microsoft.com/office/word/2023/wordml/word16du" xmlns:w16sdtdh="http://schemas.microsoft.com/office/word/2020/wordml/sdtdatahash" xmlns:w16sdtfl="http://schemas.microsoft.com/office/word/2024/wordml/sdtformatlock" xmlns:w16se="http://schemas.microsoft.com/office/word/2015/wordml/symex" xmlns:wpg="http://schemas.microsoft.com/office/word/2010/wordprocessingGroup" xmlns:wpi="http://schemas.microsoft.com/office/word/2010/wordprocessingInk" xmlns:wne="http://schemas.microsoft.com/office/word/2006/wordml" xmlns:wps="http://schemas.microsoft.com/office/word/2010/wordprocessingShape" mc:Ignorable="w14 w15 w16se w16cid w16 w16cex w16sdtdh w16sdtfl w16du wp14"/>
 </file>
 
 <file path=word/commentsExtensible.xml><?xml version="1.0" encoding="utf-8"?>
 <w16cex:commentsExtensible xmlns:wpc="http://schemas.microsoft.com/office/word/2010/wordprocessingCanvas" xmlns:cx="http://schemas.microsoft.com/office/drawing/2014/chartex" xmlns:cx1="http://schemas.microsoft.com/office/drawing/2015/9/8/chartex" xmlns:cx2="http://schemas.microsoft.com/office/drawing/2015/10/21/chartex" xmlns:cx3="http://schemas.microsoft.com/office/drawing/2016/5/9/chartex" xmlns:cx4="http://schemas.microsoft.com/office/drawing/2016/5/10/chartex" xmlns:cx5="http://schemas.microsoft.com/office/drawing/2016/5/11/chartex" xmlns:cx6="http://schemas.microsoft.com/office/drawing/2016/5/12/chartex" xmlns:cx7="http://schemas.microsoft.com/office/drawing/2016/5/13/chartex" xmlns:cx8="http://schemas.microsoft.com/office/drawing/2016/5/14/chartex" xmlns:cr="http://schemas.microsoft.com/office/comments/2020/reactions" xmlns:mc="http://schemas.openxmlformats.org/markup-compatibility/2006" xmlns:aink="http://schemas.microsoft.com/office/drawing/2016/ink" xmlns:am3d="http://schemas.microsoft.com/office/drawing/2017/model3d" xmlns:o="urn:schemas-microsoft-com:office:office" xmlns:oel="http://schemas.microsoft.com/office/2019/extlst" xmlns:r="http://schemas.openxmlformats.org/officeDocument/2006/relationships" xmlns:m="http://schemas.openxmlformats.org/officeDocument/2006/math" xmlns:v="urn:schemas-microsoft-com:vml" xmlns:wp14="http://schemas.microsoft.com/office/word/2010/wordprocessingDrawing" xmlns:wp="http://schemas.openxmlformats.org/drawingml/2006/wordprocessingDrawing" xmlns:w10="urn:schemas-microsoft-com:office:word" xmlns:w="http://schemas.openxmlformats.org/wordprocessingml/2006/main" xmlns:w14="http://schemas.microsoft.com/office/word/2010/wordml" xmlns:w15="http://schemas.microsoft.com/office/word/2012/wordml" xmlns:w16cex="http://schemas.microsoft.com/office/word/2018/wordml/cex" xmlns:w16cid="http://schemas.microsoft.com/office/word/2016/wordml/cid" xmlns:w16="http://schemas.microsoft.com/office/word/2018/wordml" xmlns:w16du="http://schemas.microsoft.com/office/word/2023/wordml/word16du" xmlns:w16sdtdh="http://schemas.microsoft.com/office/word/2020/wordml/sdtdatahash" xmlns:w16sdtfl="http://schemas.microsoft.com/office/word/2024/wordml/sdtformatlock" xmlns:w16se="http://schemas.microsoft.com/office/word/2015/wordml/symex" xmlns:wpg="http://schemas.microsoft.com/office/word/2010/wordprocessingGroup" xmlns:wpi="http://schemas.microsoft.com/office/word/2010/wordprocessingInk" xmlns:wne="http://schemas.microsoft.com/office/word/2006/wordml" xmlns:wps="http://schemas.microsoft.com/office/word/2010/wordprocessingShape" mc:Ignorable="w14 w15 w16se w16cid w16 w16cex w16sdtdh w16sdtfl cr w16du wp14">
+  <w16cex:commentExtensible w16cex:durableId="165B302B" w16cex:dateUtc="2026-07-11T14:37:00Z"/>
   <w16cex:commentExtensible w16cex:durableId="40C50491" w16cex:dateUtc="2026-07-09T00:18:00Z"/>
+  <w16cex:commentExtensible w16cex:durableId="45A514ED" w16cex:dateUtc="2026-07-11T14:55:00Z"/>
+  <w16cex:commentExtensible w16cex:durableId="03DAB0E7" w16cex:dateUtc="2026-07-11T14:05:00Z"/>
+  <w16cex:commentExtensible w16cex:durableId="1810501A" w16cex:dateUtc="2026-07-11T14:57:00Z"/>
   <w16cex:commentExtensible w16cex:durableId="6DFE7B04" w16cex:dateUtc="2026-07-09T00:39:00Z"/>
   <w16cex:commentExtensible w16cex:durableId="6D5D3E52" w16cex:dateUtc="2026-07-09T00:36:00Z"/>
+  <w16cex:commentExtensible w16cex:durableId="3D4D8B5F" w16cex:dateUtc="2026-07-11T15:00:00Z"/>
+  <w16cex:commentExtensible w16cex:durableId="7A46F705" w16cex:dateUtc="2026-07-11T15:01:00Z"/>
   <w16cex:commentExtensible w16cex:durableId="611E5C2B" w16cex:dateUtc="2026-07-09T00:37:00Z"/>
   <w16cex:commentExtensible w16cex:durableId="1D900B36" w16cex:dateUtc="2026-07-09T00:39:00Z"/>
+  <w16cex:commentExtensible w16cex:durableId="0AF7FDD5" w16cex:dateUtc="2026-07-11T15:04:00Z"/>
+  <w16cex:commentExtensible w16cex:durableId="3C157B79" w16cex:dateUtc="2026-07-11T15:05:00Z"/>
   <w16cex:commentExtensible w16cex:durableId="7F8C14AE" w16cex:dateUtc="2026-07-09T00:41:00Z"/>
+  <w16cex:commentExtensible w16cex:durableId="292AD1F1" w16cex:dateUtc="2026-07-11T15:08:00Z"/>
   <w16cex:commentExtensible w16cex:durableId="640EAFC5" w16cex:dateUtc="2026-07-09T00:41:00Z"/>
   <w16cex:commentExtensible w16cex:durableId="6719C462" w16cex:dateUtc="2026-07-09T00:42:00Z"/>
   <w16cex:commentExtensible w16cex:durableId="46F9A7AC" w16cex:dateUtc="2026-07-09T00:43:00Z"/>
+  <w16cex:commentExtensible w16cex:durableId="537CDEB3" w16cex:dateUtc="2026-07-11T14:07:00Z"/>
+  <w16cex:commentExtensible w16cex:durableId="1AB21ADA" w16cex:dateUtc="2026-07-11T15:11:00Z"/>
 </w16cex:commentsExtensible>
 </file>
 
 <file path=word/commentsIds.xml><?xml version="1.0" encoding="utf-8"?>
-<w16cid:commentsIds xmlns:wpc="http://schemas.microsoft.com/office/word/2010/wordprocessingCanvas" xmlns:cx="http://schemas.microsoft.com/office/drawing/2014/chartex" xmlns:cx1="http://schemas.microsoft.com/office/drawing/2015/9/8/chartex" xmlns:cx2="http://schemas.microsoft.com/office/drawing/2015/10/21/chartex" xmlns:cx3="http://schemas.microsoft.com/office/drawing/2016/5/9/chartex" xmlns:cx4="http://schemas.microsoft.com/office/drawing/2016/5/10/chartex" xmlns:cx5="http://schemas.microsoft.com/office/drawing/2016/5/11/chartex" xmlns:cx6="http://schemas.microsoft.com/office/drawing/2016/5/12/chartex" xmlns:cx7="http://schemas.microsoft.com/office/drawing/2016/5/13/chartex" xmlns:cx8="http://schemas.microsoft.com/office/drawing/2016/5/14/chartex" xmlns:mc="http://schemas.openxmlformats.org/markup-compatibility/2006" xmlns:aink="http://schemas.microsoft.com/office/drawing/2016/ink" xmlns:am3d="http://schemas.microsoft.com/office/drawing/2017/model3d" xmlns:o="urn:schemas-microsoft-com:office:office" xmlns:oel="http://schemas.microsoft.com/office/2019/extlst" xmlns:r="http://schemas.openxmlformats.org/officeDocument/2006/relationships" xmlns:m="http://schemas.openxmlformats.org/officeDocument/2006/math" xmlns:v="urn:schemas-microsoft-com:vml" xmlns:wp14="http://schemas.microsoft.com/office/word/2010/wordprocessingDrawing" xmlns:wp="http://schemas.openxmlformats.org/drawingml/2006/wordprocessingDrawing" xmlns:w10="urn:schemas-microsoft-com:office:word" xmlns:w="http://schemas.openxmlformats.org/wordprocessingml/2006/main" xmlns:w14="http://schemas.microsoft.com/office/word/2010/wordml" xmlns:w15="http://schemas.microsoft.com/office/word/2012/wordml" xmlns:w16cex="http://schemas.microsoft.com/office/word/2018/wordml/cex" xmlns:w16cid="http://schemas.microsoft.com/office/word/2016/wordml/cid" xmlns:w16="http://schemas.microsoft.com/office/word/2018/wordml" xmlns:w16du="http://schemas.microsoft.com/office/word/2023/wordml/word16du" xmlns:w16sdtdh="http://schemas.microsoft.com/office/word/2020/wordml/sdtdatahash" xmlns:w16sdtfl="http://schemas.microsoft.com/office/word/2024/wordml/sdtformatlock" xmlns:w16se="http://schemas.microsoft.com/office/word/2015/wordml/symex" xmlns:wpg="http://schemas.microsoft.com/office/word/2010/wordprocessingGroup" xmlns:wpi="http://schemas.microsoft.com/office/word/2010/wordprocessingInk" xmlns:wne="http://schemas.microsoft.com/office/word/2006/wordml" xmlns:wps="http://schemas.microsoft.com/office/word/2010/wordprocessingShape" mc:Ignorable="w14 w15 w16se w16cid w16 w16cex w16sdtdh w16sdtfl w16du wp14">
-  <w16cid:commentId w16cid:paraId="42DB2C3E" w16cid:durableId="40C50491"/>
-  <w16cid:commentId w16cid:paraId="3AF30051" w16cid:durableId="6DFE7B04"/>
-  <w16cid:commentId w16cid:paraId="56E0FEBE" w16cid:durableId="6D5D3E52"/>
-  <w16cid:commentId w16cid:paraId="5BDBC21D" w16cid:durableId="611E5C2B"/>
-  <w16cid:commentId w16cid:paraId="4B3ADC4A" w16cid:durableId="1D900B36"/>
-  <w16cid:commentId w16cid:paraId="5D2B74BB" w16cid:durableId="7F8C14AE"/>
-  <w16cid:commentId w16cid:paraId="2815AA70" w16cid:durableId="640EAFC5"/>
-  <w16cid:commentId w16cid:paraId="06BA7F9F" w16cid:durableId="6719C462"/>
-  <w16cid:commentId w16cid:paraId="0A164EE6" w16cid:durableId="46F9A7AC"/>
-</w16cid:commentsIds>
+<w16cid:commentsIds xmlns:wpc="http://schemas.microsoft.com/office/word/2010/wordprocessingCanvas" xmlns:cx="http://schemas.microsoft.com/office/drawing/2014/chartex" xmlns:cx1="http://schemas.microsoft.com/office/drawing/2015/9/8/chartex" xmlns:cx2="http://schemas.microsoft.com/office/drawing/2015/10/21/chartex" xmlns:cx3="http://schemas.microsoft.com/office/drawing/2016/5/9/chartex" xmlns:cx4="http://schemas.microsoft.com/office/drawing/2016/5/10/chartex" xmlns:cx5="http://schemas.microsoft.com/office/drawing/2016/5/11/chartex" xmlns:cx6="http://schemas.microsoft.com/office/drawing/2016/5/12/chartex" xmlns:cx7="http://schemas.microsoft.com/office/drawing/2016/5/13/chartex" xmlns:cx8="http://schemas.microsoft.com/office/drawing/2016/5/14/chartex" xmlns:mc="http://schemas.openxmlformats.org/markup-compatibility/2006" xmlns:aink="http://schemas.microsoft.com/office/drawing/2016/ink" xmlns:am3d="http://schemas.microsoft.com/office/drawing/2017/model3d" xmlns:o="urn:schemas-microsoft-com:office:office" xmlns:oel="http://schemas.microsoft.com/office/2019/extlst" xmlns:r="http://schemas.openxmlformats.org/officeDocument/2006/relationships" xmlns:m="http://schemas.openxmlformats.org/officeDocument/2006/math" xmlns:v="urn:schemas-microsoft-com:vml" xmlns:wp14="http://schemas.microsoft.com/office/word/2010/wordprocessingDrawing" xmlns:wp="http://schemas.openxmlformats.org/drawingml/2006/wordprocessingDrawing" xmlns:w10="urn:schemas-microsoft-com:office:word" xmlns:w="http://schemas.openxmlformats.org/wordprocessingml/2006/main" xmlns:w14="http://schemas.microsoft.com/office/word/2010/wordml" xmlns:w15="http://schemas.microsoft.com/office/word/2012/wordml" xmlns:w16cex="http://schemas.microsoft.com/office/word/2018/wordml/cex" xmlns:w16cid="http://schemas.microsoft.com/office/word/2016/wordml/cid" xmlns:w16="http://schemas.microsoft.com/office/word/2018/wordml" xmlns:w16du="http://schemas.microsoft.com/office/word/2023/wordml/word16du" xmlns:w16sdtdh="http://schemas.microsoft.com/office/word/2020/wordml/sdtdatahash" xmlns:w16sdtfl="http://schemas.microsoft.com/office/word/2024/wordml/sdtformatlock" xmlns:w16se="http://schemas.microsoft.com/office/word/2015/wordml/symex" xmlns:wpg="http://schemas.microsoft.com/office/word/2010/wordprocessingGroup" xmlns:wpi="http://schemas.microsoft.com/office/word/2010/wordprocessingInk" xmlns:wne="http://schemas.microsoft.com/office/word/2006/wordml" xmlns:wps="http://schemas.microsoft.com/office/word/2010/wordprocessingShape" mc:Ignorable="w14 w15 w16se w16cid w16 w16cex w16sdtdh w16sdtfl w16du wp14"/>
 </file>
 
 <file path=word/numbering.xml><?xml version="1.0" encoding="utf-8"?>
@@ -2945,25 +3159,25 @@
       </w:pPr>
     </w:lvl>
   </w:abstractNum>
-  <w:num w:numId="1" w16cid:durableId="758259250">
+  <w:num w:numId="1" w16cid:durableId="689528481">
     <w:abstractNumId w:val="1"/>
   </w:num>
-  <w:num w:numId="2" w16cid:durableId="1834028155">
+  <w:num w:numId="2" w16cid:durableId="395857235">
     <w:abstractNumId w:val="5"/>
   </w:num>
-  <w:num w:numId="3" w16cid:durableId="955480393">
+  <w:num w:numId="3" w16cid:durableId="2109081250">
     <w:abstractNumId w:val="2"/>
   </w:num>
-  <w:num w:numId="4" w16cid:durableId="160388019">
+  <w:num w:numId="4" w16cid:durableId="380593236">
     <w:abstractNumId w:val="3"/>
   </w:num>
-  <w:num w:numId="5" w16cid:durableId="386225640">
+  <w:num w:numId="5" w16cid:durableId="551889128">
     <w:abstractNumId w:val="6"/>
   </w:num>
-  <w:num w:numId="6" w16cid:durableId="1808663101">
+  <w:num w:numId="6" w16cid:durableId="1977177740">
     <w:abstractNumId w:val="4"/>
   </w:num>
-  <w:num w:numId="7" w16cid:durableId="2031836533">
+  <w:num w:numId="7" w16cid:durableId="1743288041">
     <w:abstractNumId w:val="0"/>
   </w:num>
 </w:numbering>
@@ -2973,6 +3187,9 @@
 <w15:people xmlns:wpc="http://schemas.microsoft.com/office/word/2010/wordprocessingCanvas" xmlns:cx="http://schemas.microsoft.com/office/drawing/2014/chartex" xmlns:cx1="http://schemas.microsoft.com/office/drawing/2015/9/8/chartex" xmlns:cx2="http://schemas.microsoft.com/office/drawing/2015/10/21/chartex" xmlns:cx3="http://schemas.microsoft.com/office/drawing/2016/5/9/chartex" xmlns:cx4="http://schemas.microsoft.com/office/drawing/2016/5/10/chartex" xmlns:cx5="http://schemas.microsoft.com/office/drawing/2016/5/11/chartex" xmlns:cx6="http://schemas.microsoft.com/office/drawing/2016/5/12/chartex" xmlns:cx7="http://schemas.microsoft.com/office/drawing/2016/5/13/chartex" xmlns:cx8="http://schemas.microsoft.com/office/drawing/2016/5/14/chartex" xmlns:mc="http://schemas.openxmlformats.org/markup-compatibility/2006" xmlns:aink="http://schemas.microsoft.com/office/drawing/2016/ink" xmlns:am3d="http://schemas.microsoft.com/office/drawing/2017/model3d" xmlns:o="urn:schemas-microsoft-com:office:office" xmlns:oel="http://schemas.microsoft.com/office/2019/extlst" xmlns:r="http://schemas.openxmlformats.org/officeDocument/2006/relationships" xmlns:m="http://schemas.openxmlformats.org/officeDocument/2006/math" xmlns:v="urn:schemas-microsoft-com:vml" xmlns:wp14="http://schemas.microsoft.com/office/word/2010/wordprocessingDrawing" xmlns:wp="http://schemas.openxmlformats.org/drawingml/2006/wordprocessingDrawing" xmlns:w10="urn:schemas-microsoft-com:office:word" xmlns:w="http://schemas.openxmlformats.org/wordprocessingml/2006/main" xmlns:w14="http://schemas.microsoft.com/office/word/2010/wordml" xmlns:w15="http://schemas.microsoft.com/office/word/2012/wordml" xmlns:w16cex="http://schemas.microsoft.com/office/word/2018/wordml/cex" xmlns:w16cid="http://schemas.microsoft.com/office/word/2016/wordml/cid" xmlns:w16="http://schemas.microsoft.com/office/word/2018/wordml" xmlns:w16du="http://schemas.microsoft.com/office/word/2023/wordml/word16du" xmlns:w16sdtdh="http://schemas.microsoft.com/office/word/2020/wordml/sdtdatahash" xmlns:w16sdtfl="http://schemas.microsoft.com/office/word/2024/wordml/sdtformatlock" xmlns:w16se="http://schemas.microsoft.com/office/word/2015/wordml/symex" xmlns:wpg="http://schemas.microsoft.com/office/word/2010/wordprocessingGroup" xmlns:wpi="http://schemas.microsoft.com/office/word/2010/wordprocessingInk" xmlns:wne="http://schemas.microsoft.com/office/word/2006/wordml" xmlns:wps="http://schemas.microsoft.com/office/word/2010/wordprocessingShape" mc:Ignorable="w14 w15 w16se w16cid w16 w16cex w16sdtdh w16sdtfl w16du wp14">
   <w15:person w15:author="Craig Glennie">
     <w15:presenceInfo w15:providerId="Windows Live" w15:userId="2ac5bc603104b5e8"/>
+  </w15:person>
+  <w15:person w15:author="Microsoft account">
+    <w15:presenceInfo w15:providerId="Windows Live" w15:userId="40cc342490cd5daf"/>
   </w15:person>
 </w15:people>
 </file>
@@ -2990,7 +3207,7 @@
     </w:rPrDefault>
     <w:pPrDefault>
       <w:pPr>
-        <w:spacing w:after="120" w:line="240" w:lineRule="auto"/>
+        <w:spacing w:after="120"/>
       </w:pPr>
     </w:pPrDefault>
   </w:docDefaults>
@@ -3420,7 +3637,7 @@
     <w:uiPriority w:val="59"/>
     <w:rsid w:val="003A210A"/>
     <w:pPr>
-      <w:spacing w:after="0" w:line="240" w:lineRule="auto"/>
+      <w:spacing w:after="0"/>
     </w:pPr>
     <w:rPr>
       <w:rFonts w:eastAsiaTheme="minorEastAsia"/>
@@ -3443,7 +3660,7 @@
     <w:semiHidden/>
     <w:rsid w:val="00BC2DC4"/>
     <w:pPr>
-      <w:spacing w:after="0" w:line="240" w:lineRule="auto"/>
+      <w:spacing w:after="0"/>
     </w:pPr>
   </w:style>
   <w:style w:type="character" w:styleId="CommentReference">
@@ -3466,9 +3683,6 @@
     <w:semiHidden/>
     <w:unhideWhenUsed/>
     <w:rsid w:val="003131C9"/>
-    <w:pPr>
-      <w:spacing w:line="240" w:lineRule="auto"/>
-    </w:pPr>
     <w:rPr>
       <w:sz w:val="20"/>
       <w:szCs w:val="20"/>
@@ -3521,13 +3735,64 @@
       <w:autoSpaceDE w:val="0"/>
       <w:autoSpaceDN w:val="0"/>
       <w:adjustRightInd w:val="0"/>
-      <w:spacing w:after="0" w:line="240" w:lineRule="auto"/>
+      <w:spacing w:after="0"/>
     </w:pPr>
     <w:rPr>
       <w:rFonts w:ascii="Times New Roman" w:hAnsi="Arial" w:cs="Arial"/>
       <w:color w:val="000000"/>
-      <w:sz w:val="24"/>
-      <w:szCs w:val="24"/>
+    </w:rPr>
+  </w:style>
+  <w:style w:type="paragraph" w:styleId="BalloonText">
+    <w:name w:val="Balloon Text"/>
+    <w:basedOn w:val="Normal"/>
+    <w:link w:val="BalloonTextChar"/>
+    <w:uiPriority w:val="99"/>
+    <w:semiHidden/>
+    <w:unhideWhenUsed/>
+    <w:rsid w:val="00135D6F"/>
+    <w:pPr>
+      <w:spacing w:after="0"/>
+    </w:pPr>
+    <w:rPr>
+      <w:rFonts w:ascii="Segoe UI" w:hAnsi="Segoe UI" w:cs="Segoe UI"/>
+      <w:sz w:val="18"/>
+      <w:szCs w:val="18"/>
+    </w:rPr>
+  </w:style>
+  <w:style w:type="character" w:customStyle="1" w:styleId="BalloonTextChar">
+    <w:name w:val="Balloon Text Char"/>
+    <w:basedOn w:val="DefaultParagraphFont"/>
+    <w:link w:val="BalloonText"/>
+    <w:uiPriority w:val="99"/>
+    <w:semiHidden/>
+    <w:rsid w:val="00135D6F"/>
+    <w:rPr>
+      <w:rFonts w:ascii="Segoe UI" w:hAnsi="Segoe UI" w:cs="Segoe UI"/>
+      <w:sz w:val="18"/>
+      <w:szCs w:val="18"/>
+    </w:rPr>
+  </w:style>
+  <w:style w:type="character" w:styleId="Hyperlink">
+    <w:name w:val="Hyperlink"/>
+    <w:basedOn w:val="DefaultParagraphFont"/>
+    <w:uiPriority w:val="99"/>
+    <w:unhideWhenUsed/>
+    <w:rsid w:val="008433FF"/>
+    <w:rPr>
+      <w:color w:val="0563C1" w:themeColor="hyperlink"/>
+      <w:u w:val="single"/>
+    </w:rPr>
+  </w:style>
+  <w:style w:type="character" w:styleId="UnresolvedMention">
+    <w:name w:val="Unresolved Mention"/>
+    <w:basedOn w:val="DefaultParagraphFont"/>
+    <w:uiPriority w:val="99"/>
+    <w:semiHidden/>
+    <w:unhideWhenUsed/>
+    <w:rsid w:val="008433FF"/>
+    <w:rPr>
+      <w:color w:val="605E5C"/>
+      <w:shd w:val="clear" w:color="auto" w:fill="E1DFDD"/>
     </w:rPr>
   </w:style>
 </w:styles>

</xml_diff>